<commit_message>
feat: account_subtype routing + updated playbooks + commercialista welcome email
</commit_message>
<xml_diff>
--- a/backend/app/static/playbooks/CEI_Commercialista_Playbook_EN.docx
+++ b/backend/app/static/playbooks/CEI_Commercialista_Playbook_EN.docx
@@ -8,16 +8,44 @@
         <w:jc w:val="center"/>
       </w:pPr>
       <w:r>
-        <w:rPr>
-          <w:rFonts w:ascii="Arial" w:cs="Arial" w:eastAsia="Arial" w:hAnsi="Arial"/>
-          <w:b/>
-          <w:bCs/>
-          <w:caps/>
-          <w:color w:val="38BDF8"/>
-          <w:sz w:val="20"/>
-          <w:szCs w:val="20"/>
-        </w:rPr>
-        <w:t xml:space="preserve">CARBON EFFICIENCY INTELLIGENCE</w:t>
+        <w:drawing>
+          <wp:inline distT="0" distB="0" distL="0" distR="0">
+            <wp:extent cx="1047750" cy="1047750"/>
+            <wp:effectExtent t="0" r="0" b="0" l="0"/>
+            <wp:docPr id="1" name="" descr="" title=""/>
+            <wp:cNvGraphicFramePr>
+              <a:graphicFrameLocks xmlns:a="http://schemas.openxmlformats.org/drawingml/2006/main" noChangeAspect="1"/>
+            </wp:cNvGraphicFramePr>
+            <a:graphic xmlns:a="http://schemas.openxmlformats.org/drawingml/2006/main">
+              <a:graphicData uri="http://schemas.openxmlformats.org/drawingml/2006/picture">
+                <pic:pic xmlns:pic="http://schemas.openxmlformats.org/drawingml/2006/picture">
+                  <pic:nvPicPr>
+                    <pic:cNvPr id="0" name="" descr=""/>
+                    <pic:cNvPicPr>
+                      <a:picLocks noChangeAspect="1" noChangeArrowheads="1"/>
+                    </pic:cNvPicPr>
+                  </pic:nvPicPr>
+                  <pic:blipFill>
+                    <a:blip r:embed="rId7" cstate="none"/>
+                    <a:srcRect/>
+                    <a:stretch>
+                      <a:fillRect/>
+                    </a:stretch>
+                  </pic:blipFill>
+                  <pic:spPr bwMode="auto">
+                    <a:xfrm>
+                      <a:off x="0" y="0"/>
+                      <a:ext cx="1047750" cy="1047750"/>
+                    </a:xfrm>
+                    <a:prstGeom prst="rect">
+                      <a:avLst/>
+                    </a:prstGeom>
+                  </pic:spPr>
+                </pic:pic>
+              </a:graphicData>
+            </a:graphic>
+          </wp:inline>
+        </w:drawing>
       </w:r>
     </w:p>
     <w:p>
@@ -34,7 +62,7 @@
           <w:sz w:val="52"/>
           <w:szCs w:val="52"/>
         </w:rPr>
-        <w:t xml:space="preserve">CEI Commercialista Playbook</w:t>
+        <w:t xml:space="preserve">CEI Accountant Playbook</w:t>
       </w:r>
     </w:p>
     <w:p>
@@ -69,7 +97,7 @@
           <w:sz w:val="22"/>
           <w:szCs w:val="22"/>
         </w:rPr>
-        <w:t xml:space="preserve">For Commercialisti · Tax Advisors · Accountants</w:t>
+        <w:t xml:space="preserve">For Commercialisti  ·  Tax Advisors  ·  Accountants</w:t>
       </w:r>
     </w:p>
     <w:p>
@@ -158,7 +186,7 @@
           <w:sz w:val="22"/>
           <w:szCs w:val="22"/>
         </w:rPr>
-        <w:t xml:space="preserve">From September 2027, every Italian manufacturing SME exporting or importing CBAM-regulated goods (ceramics, cement, steel, aluminium, fertilizers, hydrogen) must file an annual declaration with verified CO₂ emission data. Factories that file without a verified baseline pay using EU default emission factors — which are consistently higher than actual figures, costing them thousands of euros in unnecessary carbon costs.</w:t>
+        <w:t xml:space="preserve">From September 2027, every Italian manufacturing SME exporting or importing CBAM-regulated goods (ceramics, cement, steel, aluminium, fertilizers, hydrogen) must file an annual declaration with verified CO2 emission data. Factories that file without a verified baseline pay using EU default emission factors — which are consistently higher than actual figures, costing them thousands of euros in unnecessary carbon costs.</w:t>
       </w:r>
     </w:p>
     <w:p>
@@ -210,7 +238,7 @@
                 <w:sz w:val="20"/>
                 <w:szCs w:val="20"/>
               </w:rPr>
-              <w:t xml:space="preserve">A verified energy baseline produced from existing utility bills can save a typical ceramics factory €8,000–€25,000 per year in CBAM compliance costs. No hardware installation required.</w:t>
+              <w:t xml:space="preserve">A verified energy baseline produced from existing utility bills can save a typical ceramics factory EUR 8,000-25,000 per year in CBAM compliance costs. No hardware installation required.</w:t>
             </w:r>
           </w:p>
         </w:tc>
@@ -314,7 +342,7 @@
                 <w:sz w:val="20"/>
                 <w:szCs w:val="20"/>
               </w:rPr>
-              <w:t xml:space="preserve">Plain-language report: CO₂ position, financial exposure in euros, default vs. verified cost gap, CBAM timeline to September 2027.</w:t>
+              <w:t xml:space="preserve">Plain-language report: CO2 position, financial exposure in euros, default vs. verified cost gap, CBAM timeline to September 2027.</w:t>
             </w:r>
           </w:p>
         </w:tc>
@@ -535,7 +563,6 @@
               <w:bottom w:type="dxa" w:w="100"/>
               <w:right w:type="dxa" w:w="120"/>
             </w:tcMar>
-            <w:vAlign w:val="center"/>
           </w:tcPr>
           <w:p>
             <w:pPr>
@@ -617,7 +644,6 @@
               <w:bottom w:type="dxa" w:w="100"/>
               <w:right w:type="dxa" w:w="120"/>
             </w:tcMar>
-            <w:vAlign w:val="center"/>
           </w:tcPr>
           <w:p>
             <w:pPr>
@@ -677,7 +703,7 @@
                 <w:sz w:val="20"/>
                 <w:szCs w:val="20"/>
               </w:rPr>
-              <w:t xml:space="preserve">CEI will ask which type of consultant you are. Select this option.</w:t>
+              <w:t xml:space="preserve">CEI asks which type of consultant you are. Select this option.</w:t>
             </w:r>
           </w:p>
         </w:tc>
@@ -699,7 +725,6 @@
               <w:bottom w:type="dxa" w:w="100"/>
               <w:right w:type="dxa" w:w="120"/>
             </w:tcMar>
-            <w:vAlign w:val="center"/>
           </w:tcPr>
           <w:p>
             <w:pPr>
@@ -781,7 +806,6 @@
               <w:bottom w:type="dxa" w:w="100"/>
               <w:right w:type="dxa" w:w="120"/>
             </w:tcMar>
-            <w:vAlign w:val="center"/>
           </w:tcPr>
           <w:p>
             <w:pPr>
@@ -975,28 +999,6 @@
           <w:szCs w:val="26"/>
         </w:rPr>
         <w:t xml:space="preserve">Path A — Invite Link (Recommended)</w:t>
-      </w:r>
-    </w:p>
-    <w:p>
-      <w:pPr>
-        <w:spacing w:after="60" w:before="60"/>
-      </w:pPr>
-      <w:r>
-        <w:rPr>
-          <w:rFonts w:ascii="Arial" w:cs="Arial" w:eastAsia="Arial" w:hAnsi="Arial"/>
-          <w:color w:val="0F172A"/>
-          <w:sz w:val="22"/>
-          <w:szCs w:val="22"/>
-        </w:rPr>
-        <w:t xml:space="preserve">Generate a secure invite link and send it to the factory. When they click it and sign up, their account connects to yours automatically.</w:t>
-      </w:r>
-    </w:p>
-    <w:p>
-      <w:pPr>
-        <w:spacing w:after="0" w:before="0"/>
-      </w:pPr>
-      <w:r>
-        <w:t xml:space="preserve"/>
       </w:r>
     </w:p>
     <w:tbl>
@@ -1032,7 +1034,6 @@
               <w:bottom w:type="dxa" w:w="100"/>
               <w:right w:type="dxa" w:w="120"/>
             </w:tcMar>
-            <w:vAlign w:val="center"/>
           </w:tcPr>
           <w:p>
             <w:pPr>
@@ -1114,7 +1115,6 @@
               <w:bottom w:type="dxa" w:w="100"/>
               <w:right w:type="dxa" w:w="120"/>
             </w:tcMar>
-            <w:vAlign w:val="center"/>
           </w:tcPr>
           <w:p>
             <w:pPr>
@@ -1174,7 +1174,7 @@
                 <w:sz w:val="20"/>
                 <w:szCs w:val="20"/>
               </w:rPr>
-              <w:t xml:space="preserve">Enter the factory name and optionally their email address. Click '+ New Invite Link'.</w:t>
+              <w:t xml:space="preserve">Enter the factory name and optionally their email. Click '+ New Invite Link'.</w:t>
             </w:r>
           </w:p>
         </w:tc>
@@ -1196,7 +1196,6 @@
               <w:bottom w:type="dxa" w:w="100"/>
               <w:right w:type="dxa" w:w="120"/>
             </w:tcMar>
-            <w:vAlign w:val="center"/>
           </w:tcPr>
           <w:p>
             <w:pPr>
@@ -1278,7 +1277,6 @@
               <w:bottom w:type="dxa" w:w="100"/>
               <w:right w:type="dxa" w:w="120"/>
             </w:tcMar>
-            <w:vAlign w:val="center"/>
           </w:tcPr>
           <w:p>
             <w:pPr>
@@ -1360,7 +1358,6 @@
               <w:bottom w:type="dxa" w:w="100"/>
               <w:right w:type="dxa" w:w="120"/>
             </w:tcMar>
-            <w:vAlign w:val="center"/>
           </w:tcPr>
           <w:p>
             <w:pPr>
@@ -1491,8 +1488,19 @@
     </w:p>
     <w:p>
       <w:pPr>
-        <w:pStyle w:val="Heading2"/>
-        <w:spacing w:after="120" w:before="300"/>
+        <w:spacing w:after="0" w:before="0"/>
+      </w:pPr>
+      <w:r>
+        <w:t xml:space="preserve"/>
+      </w:r>
+    </w:p>
+    <w:p>
+      <w:pPr>
+        <w:pStyle w:val="Heading1"/>
+        <w:pBdr>
+          <w:bottom w:val="single" w:color="38BDF8" w:sz="6" w:space="4"/>
+        </w:pBdr>
+        <w:spacing w:after="180" w:before="360"/>
       </w:pPr>
       <w:r>
         <w:rPr>
@@ -1500,32 +1508,10 @@
           <w:b/>
           <w:bCs/>
           <w:color w:val="0F172A"/>
-          <w:sz w:val="26"/>
-          <w:szCs w:val="26"/>
+          <w:sz w:val="32"/>
+          <w:szCs w:val="32"/>
         </w:rPr>
-        <w:t xml:space="preserve">Path B — Create Client Organization Directly</w:t>
-      </w:r>
-    </w:p>
-    <w:p>
-      <w:pPr>
-        <w:spacing w:after="60" w:before="60"/>
-      </w:pPr>
-      <w:r>
-        <w:rPr>
-          <w:rFonts w:ascii="Arial" w:cs="Arial" w:eastAsia="Arial" w:hAnsi="Arial"/>
-          <w:color w:val="0F172A"/>
-          <w:sz w:val="22"/>
-          <w:szCs w:val="22"/>
-        </w:rPr>
-        <w:t xml:space="preserve">If the factory does not have a CEI account and you want to set everything up yourself, you can create the organization on their behalf from the technical Manage dashboard.</w:t>
-      </w:r>
-    </w:p>
-    <w:p>
-      <w:pPr>
-        <w:spacing w:after="0" w:before="0"/>
-      </w:pPr>
-      <w:r>
-        <w:t xml:space="preserve"/>
+        <w:t xml:space="preserve">4. Generating Co-Branded Reports</w:t>
       </w:r>
     </w:p>
     <w:tbl>
@@ -1561,7 +1547,6 @@
               <w:bottom w:type="dxa" w:w="100"/>
               <w:right w:type="dxa" w:w="120"/>
             </w:tcMar>
-            <w:vAlign w:val="center"/>
           </w:tcPr>
           <w:p>
             <w:pPr>
@@ -1607,7 +1592,7 @@
                 <w:sz w:val="22"/>
                 <w:szCs w:val="22"/>
               </w:rPr>
-              <w:t xml:space="preserve">Go to Manage dashboard</w:t>
+              <w:t xml:space="preserve">Open your Compliance Portal</w:t>
             </w:r>
           </w:p>
           <w:p>
@@ -1621,7 +1606,7 @@
                 <w:sz w:val="20"/>
                 <w:szCs w:val="20"/>
               </w:rPr>
-              <w:t xml:space="preserve">Click 'Technical dashboard →' at the bottom of the Compliance Portal, or navigate to /manage.</w:t>
+              <w:t xml:space="preserve">Go to app.carbonefficiencyintel.com/commercialista</w:t>
             </w:r>
           </w:p>
         </w:tc>
@@ -1643,7 +1628,6 @@
               <w:bottom w:type="dxa" w:w="100"/>
               <w:right w:type="dxa" w:w="120"/>
             </w:tcMar>
-            <w:vAlign w:val="center"/>
           </w:tcPr>
           <w:p>
             <w:pPr>
@@ -1689,7 +1673,7 @@
                 <w:sz w:val="22"/>
                 <w:szCs w:val="22"/>
               </w:rPr>
-              <w:t xml:space="preserve">Click + Add client org</w:t>
+              <w:t xml:space="preserve">Find the factory client card</w:t>
             </w:r>
           </w:p>
           <w:p>
@@ -1703,7 +1687,7 @@
                 <w:sz w:val="20"/>
                 <w:szCs w:val="20"/>
               </w:rPr>
-              <w:t xml:space="preserve">Find the button next to the Client organizations heading.</w:t>
+              <w:t xml:space="preserve">Each connected factory appears as a card showing compliance status and data health.</w:t>
             </w:r>
           </w:p>
         </w:tc>
@@ -1725,7 +1709,6 @@
               <w:bottom w:type="dxa" w:w="100"/>
               <w:right w:type="dxa" w:w="120"/>
             </w:tcMar>
-            <w:vAlign w:val="center"/>
           </w:tcPr>
           <w:p>
             <w:pPr>
@@ -1771,7 +1754,7 @@
                 <w:sz w:val="22"/>
                 <w:szCs w:val="22"/>
               </w:rPr>
-              <w:t xml:space="preserve">Enter factory details</w:t>
+              <w:t xml:space="preserve">Click 'CBAM Exposure' or 'Compliance Check'</w:t>
             </w:r>
           </w:p>
           <w:p>
@@ -1785,7 +1768,7 @@
                 <w:sz w:val="20"/>
                 <w:szCs w:val="20"/>
               </w:rPr>
-              <w:t xml:space="preserve">Enter the factory name, primary energy source (electricity / gas), and currency.</w:t>
+              <w:t xml:space="preserve">The button generates the report in seconds from the factory's live energy data.</w:t>
             </w:r>
           </w:p>
         </w:tc>
@@ -1807,7 +1790,6 @@
               <w:bottom w:type="dxa" w:w="100"/>
               <w:right w:type="dxa" w:w="120"/>
             </w:tcMar>
-            <w:vAlign w:val="center"/>
           </w:tcPr>
           <w:p>
             <w:pPr>
@@ -1853,7 +1835,7 @@
                 <w:sz w:val="22"/>
                 <w:szCs w:val="22"/>
               </w:rPr>
-              <w:t xml:space="preserve">Upload utility bills</w:t>
+              <w:t xml:space="preserve">PDF downloads automatically</w:t>
             </w:r>
           </w:p>
           <w:p>
@@ -1867,86 +1849,11 @@
                 <w:sz w:val="20"/>
                 <w:szCs w:val="20"/>
               </w:rPr>
-              <w:t xml:space="preserve">Open the client org, go to Sites, and upload the factory's CSV energy data.</w:t>
+              <w:t xml:space="preserve">The PDF includes your studio name in the header — ready to share with the client.</w:t>
             </w:r>
           </w:p>
         </w:tc>
       </w:tr>
-    </w:tbl>
-    <w:p>
-      <w:pPr>
-        <w:spacing w:after="0" w:before="0"/>
-      </w:pPr>
-      <w:r>
-        <w:t xml:space="preserve"/>
-      </w:r>
-    </w:p>
-    <w:p>
-      <w:pPr>
-        <w:spacing w:after="0" w:before="0"/>
-      </w:pPr>
-      <w:r>
-        <w:t xml:space="preserve"/>
-      </w:r>
-    </w:p>
-    <w:p>
-      <w:pPr>
-        <w:pStyle w:val="Heading1"/>
-        <w:pBdr>
-          <w:bottom w:val="single" w:color="38BDF8" w:sz="6" w:space="4"/>
-        </w:pBdr>
-        <w:spacing w:after="180" w:before="360"/>
-      </w:pPr>
-      <w:r>
-        <w:rPr>
-          <w:rFonts w:ascii="Arial" w:cs="Arial" w:eastAsia="Arial" w:hAnsi="Arial"/>
-          <w:b/>
-          <w:bCs/>
-          <w:color w:val="0F172A"/>
-          <w:sz w:val="32"/>
-          <w:szCs w:val="32"/>
-        </w:rPr>
-        <w:t xml:space="preserve">4. Generating Co-Branded Reports</w:t>
-      </w:r>
-    </w:p>
-    <w:p>
-      <w:pPr>
-        <w:spacing w:after="60" w:before="60"/>
-      </w:pPr>
-      <w:r>
-        <w:rPr>
-          <w:rFonts w:ascii="Arial" w:cs="Arial" w:eastAsia="Arial" w:hAnsi="Arial"/>
-          <w:color w:val="0F172A"/>
-          <w:sz w:val="22"/>
-          <w:szCs w:val="22"/>
-        </w:rPr>
-        <w:t xml:space="preserve">Once a factory is connected to your account and has energy data, you can generate reports from your Compliance Portal in one click.</w:t>
-      </w:r>
-    </w:p>
-    <w:p>
-      <w:pPr>
-        <w:spacing w:after="0" w:before="0"/>
-      </w:pPr>
-      <w:r>
-        <w:t xml:space="preserve"/>
-      </w:r>
-    </w:p>
-    <w:tbl>
-      <w:tblPr>
-        <w:tblW w:type="dxa" w:w="9026"/>
-        <w:tblBorders>
-          <w:top w:val="single" w:color="auto" w:sz="4"/>
-          <w:left w:val="single" w:color="auto" w:sz="4"/>
-          <w:bottom w:val="single" w:color="auto" w:sz="4"/>
-          <w:right w:val="single" w:color="auto" w:sz="4"/>
-          <w:insideH w:val="single" w:color="auto" w:sz="4"/>
-          <w:insideV w:val="single" w:color="auto" w:sz="4"/>
-        </w:tblBorders>
-      </w:tblPr>
-      <w:tblGrid>
-        <w:gridCol w:w="700"/>
-        <w:gridCol w:w="8326"/>
-      </w:tblGrid>
       <w:tr>
         <w:tc>
           <w:tcPr>
@@ -1964,7 +1871,6 @@
               <w:bottom w:type="dxa" w:w="100"/>
               <w:right w:type="dxa" w:w="120"/>
             </w:tcMar>
-            <w:vAlign w:val="center"/>
           </w:tcPr>
           <w:p>
             <w:pPr>
@@ -1979,7 +1885,7 @@
                 <w:sz w:val="24"/>
                 <w:szCs w:val="24"/>
               </w:rPr>
-              <w:t xml:space="preserve">1</w:t>
+              <w:t xml:space="preserve">5</w:t>
             </w:r>
           </w:p>
         </w:tc>
@@ -2010,7 +1916,7 @@
                 <w:sz w:val="22"/>
                 <w:szCs w:val="22"/>
               </w:rPr>
-              <w:t xml:space="preserve">Open your Compliance Portal</w:t>
+              <w:t xml:space="preserve">Share with the client</w:t>
             </w:r>
           </w:p>
           <w:p>
@@ -2024,335 +1930,7 @@
                 <w:sz w:val="20"/>
                 <w:szCs w:val="20"/>
               </w:rPr>
-              <w:t xml:space="preserve">Go to app.carbonefficiencyintel.com/commercialista</w:t>
-            </w:r>
-          </w:p>
-        </w:tc>
-      </w:tr>
-      <w:tr>
-        <w:tc>
-          <w:tcPr>
-            <w:tcW w:type="dxa" w:w="700"/>
-            <w:tcBorders>
-              <w:top w:val="single" w:color="38BDF8" w:sz="4"/>
-              <w:left w:val="single" w:color="38BDF8" w:sz="4"/>
-              <w:bottom w:val="single" w:color="38BDF8" w:sz="4"/>
-              <w:right w:val="single" w:color="38BDF8" w:sz="4"/>
-            </w:tcBorders>
-            <w:shd w:fill="0F172A" w:val="clear"/>
-            <w:tcMar>
-              <w:top w:type="dxa" w:w="100"/>
-              <w:left w:type="dxa" w:w="120"/>
-              <w:bottom w:type="dxa" w:w="100"/>
-              <w:right w:type="dxa" w:w="120"/>
-            </w:tcMar>
-            <w:vAlign w:val="center"/>
-          </w:tcPr>
-          <w:p>
-            <w:pPr>
-              <w:jc w:val="center"/>
-            </w:pPr>
-            <w:r>
-              <w:rPr>
-                <w:rFonts w:ascii="Arial" w:cs="Arial" w:eastAsia="Arial" w:hAnsi="Arial"/>
-                <w:b/>
-                <w:bCs/>
-                <w:color w:val="38BDF8"/>
-                <w:sz w:val="24"/>
-                <w:szCs w:val="24"/>
-              </w:rPr>
-              <w:t xml:space="preserve">2</w:t>
-            </w:r>
-          </w:p>
-        </w:tc>
-        <w:tc>
-          <w:tcPr>
-            <w:tcW w:type="dxa" w:w="8326"/>
-            <w:tcBorders>
-              <w:top w:val="single" w:color="E2E8F0" w:sz="4"/>
-              <w:left w:val="single" w:color="E2E8F0" w:sz="4"/>
-              <w:bottom w:val="single" w:color="E2E8F0" w:sz="4"/>
-              <w:right w:val="single" w:color="E2E8F0" w:sz="4"/>
-            </w:tcBorders>
-            <w:shd w:fill="F8FAFC" w:val="clear"/>
-            <w:tcMar>
-              <w:top w:type="dxa" w:w="100"/>
-              <w:left w:type="dxa" w:w="160"/>
-              <w:bottom w:type="dxa" w:w="100"/>
-              <w:right w:type="dxa" w:w="120"/>
-            </w:tcMar>
-          </w:tcPr>
-          <w:p>
-            <w:r>
-              <w:rPr>
-                <w:rFonts w:ascii="Arial" w:cs="Arial" w:eastAsia="Arial" w:hAnsi="Arial"/>
-                <w:b/>
-                <w:bCs/>
-                <w:color w:val="0F172A"/>
-                <w:sz w:val="22"/>
-                <w:szCs w:val="22"/>
-              </w:rPr>
-              <w:t xml:space="preserve">Find the factory client card</w:t>
-            </w:r>
-          </w:p>
-          <w:p>
-            <w:pPr>
-              <w:spacing w:after="0" w:before="40"/>
-            </w:pPr>
-            <w:r>
-              <w:rPr>
-                <w:rFonts w:ascii="Arial" w:cs="Arial" w:eastAsia="Arial" w:hAnsi="Arial"/>
-                <w:color w:val="64748B"/>
-                <w:sz w:val="20"/>
-                <w:szCs w:val="20"/>
-              </w:rPr>
-              <w:t xml:space="preserve">Each connected factory appears as a card showing compliance status and data health.</w:t>
-            </w:r>
-          </w:p>
-        </w:tc>
-      </w:tr>
-      <w:tr>
-        <w:tc>
-          <w:tcPr>
-            <w:tcW w:type="dxa" w:w="700"/>
-            <w:tcBorders>
-              <w:top w:val="single" w:color="38BDF8" w:sz="4"/>
-              <w:left w:val="single" w:color="38BDF8" w:sz="4"/>
-              <w:bottom w:val="single" w:color="38BDF8" w:sz="4"/>
-              <w:right w:val="single" w:color="38BDF8" w:sz="4"/>
-            </w:tcBorders>
-            <w:shd w:fill="0F172A" w:val="clear"/>
-            <w:tcMar>
-              <w:top w:type="dxa" w:w="100"/>
-              <w:left w:type="dxa" w:w="120"/>
-              <w:bottom w:type="dxa" w:w="100"/>
-              <w:right w:type="dxa" w:w="120"/>
-            </w:tcMar>
-            <w:vAlign w:val="center"/>
-          </w:tcPr>
-          <w:p>
-            <w:pPr>
-              <w:jc w:val="center"/>
-            </w:pPr>
-            <w:r>
-              <w:rPr>
-                <w:rFonts w:ascii="Arial" w:cs="Arial" w:eastAsia="Arial" w:hAnsi="Arial"/>
-                <w:b/>
-                <w:bCs/>
-                <w:color w:val="38BDF8"/>
-                <w:sz w:val="24"/>
-                <w:szCs w:val="24"/>
-              </w:rPr>
-              <w:t xml:space="preserve">3</w:t>
-            </w:r>
-          </w:p>
-        </w:tc>
-        <w:tc>
-          <w:tcPr>
-            <w:tcW w:type="dxa" w:w="8326"/>
-            <w:tcBorders>
-              <w:top w:val="single" w:color="E2E8F0" w:sz="4"/>
-              <w:left w:val="single" w:color="E2E8F0" w:sz="4"/>
-              <w:bottom w:val="single" w:color="E2E8F0" w:sz="4"/>
-              <w:right w:val="single" w:color="E2E8F0" w:sz="4"/>
-            </w:tcBorders>
-            <w:shd w:fill="FFFFFF" w:val="clear"/>
-            <w:tcMar>
-              <w:top w:type="dxa" w:w="100"/>
-              <w:left w:type="dxa" w:w="160"/>
-              <w:bottom w:type="dxa" w:w="100"/>
-              <w:right w:type="dxa" w:w="120"/>
-            </w:tcMar>
-          </w:tcPr>
-          <w:p>
-            <w:r>
-              <w:rPr>
-                <w:rFonts w:ascii="Arial" w:cs="Arial" w:eastAsia="Arial" w:hAnsi="Arial"/>
-                <w:b/>
-                <w:bCs/>
-                <w:color w:val="0F172A"/>
-                <w:sz w:val="22"/>
-                <w:szCs w:val="22"/>
-              </w:rPr>
-              <w:t xml:space="preserve">Click 'CBAM Exposure' or 'Compliance Check'</w:t>
-            </w:r>
-          </w:p>
-          <w:p>
-            <w:pPr>
-              <w:spacing w:after="0" w:before="40"/>
-            </w:pPr>
-            <w:r>
-              <w:rPr>
-                <w:rFonts w:ascii="Arial" w:cs="Arial" w:eastAsia="Arial" w:hAnsi="Arial"/>
-                <w:color w:val="64748B"/>
-                <w:sz w:val="20"/>
-                <w:szCs w:val="20"/>
-              </w:rPr>
-              <w:t xml:space="preserve">The button generates the report in seconds from the factory's live energy data.</w:t>
-            </w:r>
-          </w:p>
-        </w:tc>
-      </w:tr>
-      <w:tr>
-        <w:tc>
-          <w:tcPr>
-            <w:tcW w:type="dxa" w:w="700"/>
-            <w:tcBorders>
-              <w:top w:val="single" w:color="38BDF8" w:sz="4"/>
-              <w:left w:val="single" w:color="38BDF8" w:sz="4"/>
-              <w:bottom w:val="single" w:color="38BDF8" w:sz="4"/>
-              <w:right w:val="single" w:color="38BDF8" w:sz="4"/>
-            </w:tcBorders>
-            <w:shd w:fill="0F172A" w:val="clear"/>
-            <w:tcMar>
-              <w:top w:type="dxa" w:w="100"/>
-              <w:left w:type="dxa" w:w="120"/>
-              <w:bottom w:type="dxa" w:w="100"/>
-              <w:right w:type="dxa" w:w="120"/>
-            </w:tcMar>
-            <w:vAlign w:val="center"/>
-          </w:tcPr>
-          <w:p>
-            <w:pPr>
-              <w:jc w:val="center"/>
-            </w:pPr>
-            <w:r>
-              <w:rPr>
-                <w:rFonts w:ascii="Arial" w:cs="Arial" w:eastAsia="Arial" w:hAnsi="Arial"/>
-                <w:b/>
-                <w:bCs/>
-                <w:color w:val="38BDF8"/>
-                <w:sz w:val="24"/>
-                <w:szCs w:val="24"/>
-              </w:rPr>
-              <w:t xml:space="preserve">4</w:t>
-            </w:r>
-          </w:p>
-        </w:tc>
-        <w:tc>
-          <w:tcPr>
-            <w:tcW w:type="dxa" w:w="8326"/>
-            <w:tcBorders>
-              <w:top w:val="single" w:color="E2E8F0" w:sz="4"/>
-              <w:left w:val="single" w:color="E2E8F0" w:sz="4"/>
-              <w:bottom w:val="single" w:color="E2E8F0" w:sz="4"/>
-              <w:right w:val="single" w:color="E2E8F0" w:sz="4"/>
-            </w:tcBorders>
-            <w:shd w:fill="F8FAFC" w:val="clear"/>
-            <w:tcMar>
-              <w:top w:type="dxa" w:w="100"/>
-              <w:left w:type="dxa" w:w="160"/>
-              <w:bottom w:type="dxa" w:w="100"/>
-              <w:right w:type="dxa" w:w="120"/>
-            </w:tcMar>
-          </w:tcPr>
-          <w:p>
-            <w:r>
-              <w:rPr>
-                <w:rFonts w:ascii="Arial" w:cs="Arial" w:eastAsia="Arial" w:hAnsi="Arial"/>
-                <w:b/>
-                <w:bCs/>
-                <w:color w:val="0F172A"/>
-                <w:sz w:val="22"/>
-                <w:szCs w:val="22"/>
-              </w:rPr>
-              <w:t xml:space="preserve">PDF downloads automatically</w:t>
-            </w:r>
-          </w:p>
-          <w:p>
-            <w:pPr>
-              <w:spacing w:after="0" w:before="40"/>
-            </w:pPr>
-            <w:r>
-              <w:rPr>
-                <w:rFonts w:ascii="Arial" w:cs="Arial" w:eastAsia="Arial" w:hAnsi="Arial"/>
-                <w:color w:val="64748B"/>
-                <w:sz w:val="20"/>
-                <w:szCs w:val="20"/>
-              </w:rPr>
-              <w:t xml:space="preserve">The PDF includes your studio name in the header and 'A product of Carbon Efficiency Intelligence' in the footer.</w:t>
-            </w:r>
-          </w:p>
-        </w:tc>
-      </w:tr>
-      <w:tr>
-        <w:tc>
-          <w:tcPr>
-            <w:tcW w:type="dxa" w:w="700"/>
-            <w:tcBorders>
-              <w:top w:val="single" w:color="38BDF8" w:sz="4"/>
-              <w:left w:val="single" w:color="38BDF8" w:sz="4"/>
-              <w:bottom w:val="single" w:color="38BDF8" w:sz="4"/>
-              <w:right w:val="single" w:color="38BDF8" w:sz="4"/>
-            </w:tcBorders>
-            <w:shd w:fill="0F172A" w:val="clear"/>
-            <w:tcMar>
-              <w:top w:type="dxa" w:w="100"/>
-              <w:left w:type="dxa" w:w="120"/>
-              <w:bottom w:type="dxa" w:w="100"/>
-              <w:right w:type="dxa" w:w="120"/>
-            </w:tcMar>
-            <w:vAlign w:val="center"/>
-          </w:tcPr>
-          <w:p>
-            <w:pPr>
-              <w:jc w:val="center"/>
-            </w:pPr>
-            <w:r>
-              <w:rPr>
-                <w:rFonts w:ascii="Arial" w:cs="Arial" w:eastAsia="Arial" w:hAnsi="Arial"/>
-                <w:b/>
-                <w:bCs/>
-                <w:color w:val="38BDF8"/>
-                <w:sz w:val="24"/>
-                <w:szCs w:val="24"/>
-              </w:rPr>
-              <w:t xml:space="preserve">5</w:t>
-            </w:r>
-          </w:p>
-        </w:tc>
-        <w:tc>
-          <w:tcPr>
-            <w:tcW w:type="dxa" w:w="8326"/>
-            <w:tcBorders>
-              <w:top w:val="single" w:color="E2E8F0" w:sz="4"/>
-              <w:left w:val="single" w:color="E2E8F0" w:sz="4"/>
-              <w:bottom w:val="single" w:color="E2E8F0" w:sz="4"/>
-              <w:right w:val="single" w:color="E2E8F0" w:sz="4"/>
-            </w:tcBorders>
-            <w:shd w:fill="FFFFFF" w:val="clear"/>
-            <w:tcMar>
-              <w:top w:type="dxa" w:w="100"/>
-              <w:left w:type="dxa" w:w="160"/>
-              <w:bottom w:type="dxa" w:w="100"/>
-              <w:right w:type="dxa" w:w="120"/>
-            </w:tcMar>
-          </w:tcPr>
-          <w:p>
-            <w:r>
-              <w:rPr>
-                <w:rFonts w:ascii="Arial" w:cs="Arial" w:eastAsia="Arial" w:hAnsi="Arial"/>
-                <w:b/>
-                <w:bCs/>
-                <w:color w:val="0F172A"/>
-                <w:sz w:val="22"/>
-                <w:szCs w:val="22"/>
-              </w:rPr>
-              <w:t xml:space="preserve">Share with the client</w:t>
-            </w:r>
-          </w:p>
-          <w:p>
-            <w:pPr>
-              <w:spacing w:after="0" w:before="40"/>
-            </w:pPr>
-            <w:r>
-              <w:rPr>
-                <w:rFonts w:ascii="Arial" w:cs="Arial" w:eastAsia="Arial" w:hAnsi="Arial"/>
-                <w:color w:val="64748B"/>
-                <w:sz w:val="20"/>
-                <w:szCs w:val="20"/>
-              </w:rPr>
-              <w:t xml:space="preserve">The PDF is ready to attach to an email, present in a client meeting, or include in a tax advisory package.</w:t>
+              <w:t xml:space="preserve">Attach to an email, present in a client meeting, or include in a tax advisory package.</w:t>
             </w:r>
           </w:p>
         </w:tc>
@@ -2423,7 +2001,7 @@
           <w:sz w:val="22"/>
           <w:szCs w:val="22"/>
         </w:rPr>
-        <w:t xml:space="preserve">Executive summary in plain language: CO₂ position, financial exposure in euros</w:t>
+        <w:t xml:space="preserve">Executive summary: CO2 position and financial exposure in euros</w:t>
       </w:r>
     </w:p>
     <w:p>
@@ -2442,7 +2020,7 @@
           <w:sz w:val="22"/>
           <w:szCs w:val="22"/>
         </w:rPr>
-        <w:t xml:space="preserve">CBAM &amp; ETS Position table: verified CO₂, projected annual, free allocation, ETS surplus/deficit</w:t>
+        <w:t xml:space="preserve">CBAM &amp; ETS Position table: verified CO2, projected annual, free allocation, ETS surplus/deficit</w:t>
       </w:r>
     </w:p>
     <w:p>
@@ -2461,7 +2039,7 @@
           <w:sz w:val="22"/>
           <w:szCs w:val="22"/>
         </w:rPr>
-        <w:t xml:space="preserve">Default vs. Verified Baseline: the cost of filing without a verified baseline</w:t>
+        <w:t xml:space="preserve">Default vs. Verified Baseline: cost of filing without a verified baseline</w:t>
       </w:r>
     </w:p>
     <w:p>
@@ -2580,7 +2158,7 @@
           <w:sz w:val="22"/>
           <w:szCs w:val="22"/>
         </w:rPr>
-        <w:t xml:space="preserve">Overall Readiness Score: 0–100 with Red/Amber/Green status</w:t>
+        <w:t xml:space="preserve">Overall Readiness Score: 0-100 with Red/Amber/Green status</w:t>
       </w:r>
     </w:p>
     <w:p>
@@ -2599,7 +2177,7 @@
           <w:sz w:val="22"/>
           <w:szCs w:val="22"/>
         </w:rPr>
-        <w:t xml:space="preserve">7-area scorecard: Energy Baseline, Emissions Config, CBAM Registration, ETS Position, Benchmark, Data Coverage, Documentation</w:t>
+        <w:t xml:space="preserve">7-area scorecard with finding and recommended action per area</w:t>
       </w:r>
     </w:p>
     <w:p>
@@ -2618,26 +2196,7 @@
           <w:sz w:val="22"/>
           <w:szCs w:val="22"/>
         </w:rPr>
-        <w:t xml:space="preserve">Detailed finding per area with recommended action</w:t>
-      </w:r>
-    </w:p>
-    <w:p>
-      <w:pPr>
-        <w:pStyle w:val="ListParagraph"/>
-        <w:numPr>
-          <w:ilvl w:val="0"/>
-          <w:numId w:val="2"/>
-        </w:numPr>
-        <w:spacing w:after="40" w:before="40"/>
-      </w:pPr>
-      <w:r>
-        <w:rPr>
-          <w:rFonts w:ascii="Arial" w:cs="Arial" w:eastAsia="Arial" w:hAnsi="Arial"/>
-          <w:color w:val="0F172A"/>
-          <w:sz w:val="22"/>
-          <w:szCs w:val="22"/>
-        </w:rPr>
-        <w:t xml:space="preserve">Priority Action Plan: sorted by urgency (Immediate → Q4 2026 → Q1 2027)</w:t>
+        <w:t xml:space="preserve">Priority Action Plan: sorted by urgency</w:t>
       </w:r>
     </w:p>
     <w:p>
@@ -2693,28 +2252,6 @@
           <w:szCs w:val="32"/>
         </w:rPr>
         <w:t xml:space="preserve">5. Understanding the Compliance Status</w:t>
-      </w:r>
-    </w:p>
-    <w:p>
-      <w:pPr>
-        <w:spacing w:after="60" w:before="60"/>
-      </w:pPr>
-      <w:r>
-        <w:rPr>
-          <w:rFonts w:ascii="Arial" w:cs="Arial" w:eastAsia="Arial" w:hAnsi="Arial"/>
-          <w:color w:val="0F172A"/>
-          <w:sz w:val="22"/>
-          <w:szCs w:val="22"/>
-        </w:rPr>
-        <w:t xml:space="preserve">Each factory client card on your dashboard shows a compliance status badge derived from their data.</w:t>
-      </w:r>
-    </w:p>
-    <w:p>
-      <w:pPr>
-        <w:spacing w:after="0" w:before="0"/>
-      </w:pPr>
-      <w:r>
-        <w:t xml:space="preserve"/>
       </w:r>
     </w:p>
     <w:tbl>
@@ -2920,62 +2457,7 @@
                 <w:sz w:val="20"/>
                 <w:szCs w:val="20"/>
               </w:rPr>
-              <w:t xml:space="preserve">AT RISK — Critical gaps identified. Factory cannot file a compliant CBAM declaration without immediate action.</w:t>
-            </w:r>
-          </w:p>
-        </w:tc>
-      </w:tr>
-    </w:tbl>
-    <w:p>
-      <w:pPr>
-        <w:spacing w:after="0" w:before="0"/>
-      </w:pPr>
-      <w:r>
-        <w:t xml:space="preserve"/>
-      </w:r>
-    </w:p>
-    <w:tbl>
-      <w:tblPr>
-        <w:tblW w:type="dxa" w:w="9026"/>
-        <w:tblBorders>
-          <w:top w:val="single" w:color="auto" w:sz="4"/>
-          <w:left w:val="single" w:color="auto" w:sz="4"/>
-          <w:bottom w:val="single" w:color="auto" w:sz="4"/>
-          <w:right w:val="single" w:color="auto" w:sz="4"/>
-          <w:insideH w:val="single" w:color="auto" w:sz="4"/>
-          <w:insideV w:val="single" w:color="auto" w:sz="4"/>
-        </w:tblBorders>
-      </w:tblPr>
-      <w:tblGrid>
-        <w:gridCol w:w="9026"/>
-      </w:tblGrid>
-      <w:tr>
-        <w:tc>
-          <w:tcPr>
-            <w:tcW w:type="dxa" w:w="9026"/>
-            <w:tcBorders>
-              <w:top w:val="single" w:color="38BDF8" w:sz="4"/>
-              <w:left w:val="single" w:color="38BDF8" w:sz="16"/>
-              <w:bottom w:val="single" w:color="38BDF8" w:sz="4"/>
-              <w:right w:val="single" w:color="38BDF8" w:sz="4"/>
-            </w:tcBorders>
-            <w:shd w:fill="F0F9FF" w:val="clear"/>
-            <w:tcMar>
-              <w:top w:type="dxa" w:w="100"/>
-              <w:left w:type="dxa" w:w="200"/>
-              <w:bottom w:type="dxa" w:w="100"/>
-              <w:right w:type="dxa" w:w="160"/>
-            </w:tcMar>
-          </w:tcPr>
-          <w:p>
-            <w:r>
-              <w:rPr>
-                <w:rFonts w:ascii="Arial" w:cs="Arial" w:eastAsia="Arial" w:hAnsi="Arial"/>
-                <w:color w:val="0F172A"/>
-                <w:sz w:val="20"/>
-                <w:szCs w:val="20"/>
-              </w:rPr>
-              <w:t xml:space="preserve">The compliance status is CEI's assessment based on available data. It is a product signal, not a legal certification. For official CBAM declarations, the factory must file with their authorised verifier.</w:t>
+              <w:t xml:space="preserve">AT RISK — Critical gaps. Factory cannot file a compliant CBAM declaration without immediate action.</w:t>
             </w:r>
           </w:p>
         </w:tc>
@@ -3015,28 +2497,6 @@
           <w:szCs w:val="32"/>
         </w:rPr>
         <w:t xml:space="preserve">6. CBAM &amp; ETS Key Concepts</w:t>
-      </w:r>
-    </w:p>
-    <w:p>
-      <w:pPr>
-        <w:spacing w:after="60" w:before="60"/>
-      </w:pPr>
-      <w:r>
-        <w:rPr>
-          <w:rFonts w:ascii="Arial" w:cs="Arial" w:eastAsia="Arial" w:hAnsi="Arial"/>
-          <w:color w:val="0F172A"/>
-          <w:sz w:val="22"/>
-          <w:szCs w:val="22"/>
-        </w:rPr>
-        <w:t xml:space="preserve">You do not need to be an energy expert to use CEI. Here are the key terms that appear in reports.</w:t>
-      </w:r>
-    </w:p>
-    <w:p>
-      <w:pPr>
-        <w:spacing w:after="0" w:before="0"/>
-      </w:pPr>
-      <w:r>
-        <w:t xml:space="preserve"/>
       </w:r>
     </w:p>
     <w:tbl>
@@ -3112,7 +2572,7 @@
                 <w:sz w:val="20"/>
                 <w:szCs w:val="20"/>
               </w:rPr>
-              <w:t xml:space="preserve">Carbon Border Adjustment Mechanism (EU Regulation 2023/956). Requires importers of carbon-intensive goods to declare the embedded CO₂ content and pay for carbon costs not paid in the country of production.</w:t>
+              <w:t xml:space="preserve">Carbon Border Adjustment Mechanism (EU Regulation 2023/956). Requires declaration of embedded CO2 content for imports of carbon-intensive goods.</w:t>
             </w:r>
           </w:p>
         </w:tc>
@@ -3174,7 +2634,7 @@
                 <w:sz w:val="20"/>
                 <w:szCs w:val="20"/>
               </w:rPr>
-              <w:t xml:space="preserve">EU Emissions Trading System, 2021–2030. Factories above certain thresholds receive free carbon allowances; if they emit more than their allocation, they must buy additional allowances on the carbon market.</w:t>
+              <w:t xml:space="preserve">EU Emissions Trading System, 2021-2030. Factories receive free allowances; excess emissions must be purchased at ~EUR 65/tCO2.</w:t>
             </w:r>
           </w:p>
         </w:tc>
@@ -3236,7 +2696,7 @@
                 <w:sz w:val="20"/>
                 <w:szCs w:val="20"/>
               </w:rPr>
-              <w:t xml:space="preserve">The tonnes of CO₂ a factory is permitted to emit each year without buying allowances. Published annually by the EU ETS authority (EUTL). Decreasing by 4.4% per year until 2030.</w:t>
+              <w:t xml:space="preserve">Tonnes of CO2 a factory may emit without buying allowances. Decreasing 4.4% per year until 2030.</w:t>
             </w:r>
           </w:p>
         </w:tc>
@@ -3298,7 +2758,7 @@
                 <w:sz w:val="20"/>
                 <w:szCs w:val="20"/>
               </w:rPr>
-              <w:t xml:space="preserve">If actual emissions &lt; free allocation = surplus (factory can sell or bank allowances). If actual &gt; free allocation = deficit (factory must purchase allowances at ~€65/tCO₂).</w:t>
+              <w:t xml:space="preserve">Surplus = actual &lt; allocation (can sell/bank). Deficit = actual &gt; allocation (must purchase).</w:t>
             </w:r>
           </w:p>
         </w:tc>
@@ -3360,7 +2820,7 @@
                 <w:sz w:val="20"/>
                 <w:szCs w:val="20"/>
               </w:rPr>
-              <w:t xml:space="preserve">The EU reference intensity for each sector (tCO₂ per tonne of product). Factories above the benchmark face higher ETS costs under Phase 4 ratcheting.</w:t>
+              <w:t xml:space="preserve">EU reference intensity per sector (tCO2/tonne product). Factories above benchmark face higher ETS costs.</w:t>
             </w:r>
           </w:p>
         </w:tc>
@@ -3422,7 +2882,7 @@
                 <w:sz w:val="20"/>
                 <w:szCs w:val="20"/>
               </w:rPr>
-              <w:t xml:space="preserve">Energy and emissions data verified by an accredited third party. Allows CBAM declarations using actual emission factors rather than higher EU defaults.</w:t>
+              <w:t xml:space="preserve">Energy data verified by accredited third party. Enables CBAM declarations using actual (lower) emission factors.</w:t>
             </w:r>
           </w:p>
         </w:tc>
@@ -3455,7 +2915,7 @@
                 <w:sz w:val="20"/>
                 <w:szCs w:val="20"/>
               </w:rPr>
-              <w:t xml:space="preserve">tCO₂</w:t>
+              <w:t xml:space="preserve">September 2027</w:t>
             </w:r>
           </w:p>
         </w:tc>
@@ -3484,69 +2944,7 @@
                 <w:sz w:val="20"/>
                 <w:szCs w:val="20"/>
               </w:rPr>
-              <w:t xml:space="preserve">Tonnes of CO₂ equivalent — the unit used for all CBAM and ETS calculations.</w:t>
-            </w:r>
-          </w:p>
-        </w:tc>
-      </w:tr>
-      <w:tr>
-        <w:tc>
-          <w:tcPr>
-            <w:tcW w:type="dxa" w:w="3000"/>
-            <w:tcBorders>
-              <w:top w:val="single" w:color="E2E8F0" w:sz="4"/>
-              <w:left w:val="single" w:color="E2E8F0" w:sz="4"/>
-              <w:bottom w:val="single" w:color="E2E8F0" w:sz="4"/>
-              <w:right w:val="single" w:color="E2E8F0" w:sz="4"/>
-            </w:tcBorders>
-            <w:shd w:fill="F8FAFC" w:val="clear"/>
-            <w:tcMar>
-              <w:top w:type="dxa" w:w="80"/>
-              <w:left w:type="dxa" w:w="120"/>
-              <w:bottom w:type="dxa" w:w="80"/>
-              <w:right w:type="dxa" w:w="120"/>
-            </w:tcMar>
-          </w:tcPr>
-          <w:p>
-            <w:r>
-              <w:rPr>
-                <w:rFonts w:ascii="Arial" w:cs="Arial" w:eastAsia="Arial" w:hAnsi="Arial"/>
-                <w:b/>
-                <w:bCs/>
-                <w:color w:val="0F172A"/>
-                <w:sz w:val="20"/>
-                <w:szCs w:val="20"/>
-              </w:rPr>
-              <w:t xml:space="preserve">September 2027</w:t>
-            </w:r>
-          </w:p>
-        </w:tc>
-        <w:tc>
-          <w:tcPr>
-            <w:tcW w:type="dxa" w:w="6026"/>
-            <w:tcBorders>
-              <w:top w:val="single" w:color="E2E8F0" w:sz="4"/>
-              <w:left w:val="single" w:color="E2E8F0" w:sz="4"/>
-              <w:bottom w:val="single" w:color="E2E8F0" w:sz="4"/>
-              <w:right w:val="single" w:color="E2E8F0" w:sz="4"/>
-            </w:tcBorders>
-            <w:shd w:fill="F8FAFC" w:val="clear"/>
-            <w:tcMar>
-              <w:top w:type="dxa" w:w="80"/>
-              <w:left w:type="dxa" w:w="120"/>
-              <w:bottom w:type="dxa" w:w="80"/>
-              <w:right w:type="dxa" w:w="120"/>
-            </w:tcMar>
-          </w:tcPr>
-          <w:p>
-            <w:r>
-              <w:rPr>
-                <w:rFonts w:ascii="Arial" w:cs="Arial" w:eastAsia="Arial" w:hAnsi="Arial"/>
-                <w:color w:val="0F172A"/>
-                <w:sz w:val="20"/>
-                <w:szCs w:val="20"/>
-              </w:rPr>
-              <w:t xml:space="preserve">The deadline for the first full CBAM declaration covering the 2026 reporting year.</w:t>
+              <w:t xml:space="preserve">Deadline for first full CBAM declaration covering the 2026 reporting year.</w:t>
             </w:r>
           </w:p>
         </w:tc>
@@ -3585,29 +2983,7 @@
           <w:sz w:val="32"/>
           <w:szCs w:val="32"/>
         </w:rPr>
-        <w:t xml:space="preserve">7. Managing Your Client Portfolio</w:t>
-      </w:r>
-    </w:p>
-    <w:p>
-      <w:pPr>
-        <w:spacing w:after="60" w:before="60"/>
-      </w:pPr>
-      <w:r>
-        <w:rPr>
-          <w:rFonts w:ascii="Arial" w:cs="Arial" w:eastAsia="Arial" w:hAnsi="Arial"/>
-          <w:color w:val="0F172A"/>
-          <w:sz w:val="22"/>
-          <w:szCs w:val="22"/>
-        </w:rPr>
-        <w:t xml:space="preserve">Your Compliance Portal shows all connected factory clients. For a deeper technical view of any client, click their name to open the full management page.</w:t>
-      </w:r>
-    </w:p>
-    <w:p>
-      <w:pPr>
-        <w:spacing w:after="0" w:before="0"/>
-      </w:pPr>
-      <w:r>
-        <w:t xml:space="preserve"/>
+        <w:t xml:space="preserve">7. Getting Help</w:t>
       </w:r>
     </w:p>
     <w:tbl>
@@ -3654,7 +3030,7 @@
                 <w:sz w:val="20"/>
                 <w:szCs w:val="20"/>
               </w:rPr>
-              <w:t xml:space="preserve">Compliance Portal (/commercialista)</w:t>
+              <w:t xml:space="preserve">Technical support</w:t>
             </w:r>
           </w:p>
         </w:tc>
@@ -3683,7 +3059,7 @@
                 <w:sz w:val="20"/>
                 <w:szCs w:val="20"/>
               </w:rPr>
-              <w:t xml:space="preserve">Your default landing page. Client compliance cards, PDF generation buttons, invite link management.</w:t>
+              <w:t xml:space="preserve">support@carbonefficiencyintel.com</w:t>
             </w:r>
           </w:p>
         </w:tc>
@@ -3716,7 +3092,7 @@
                 <w:sz w:val="20"/>
                 <w:szCs w:val="20"/>
               </w:rPr>
-              <w:t xml:space="preserve">Technical Dashboard (/manage)</w:t>
+              <w:t xml:space="preserve">Platform</w:t>
             </w:r>
           </w:p>
         </w:tc>
@@ -3745,7 +3121,7 @@
                 <w:sz w:val="20"/>
                 <w:szCs w:val="20"/>
               </w:rPr>
-              <w:t xml:space="preserve">Full portfolio view with ingestion stats, alert counts, integration tokens, data upload. For ESCO-style deep technical work.</w:t>
+              <w:t xml:space="preserve">app.carbonefficiencyintel.com/commercialista</w:t>
             </w:r>
           </w:p>
         </w:tc>
@@ -3778,7 +3154,7 @@
                 <w:sz w:val="20"/>
                 <w:szCs w:val="20"/>
               </w:rPr>
-              <w:t xml:space="preserve">Client detail (/manage/client-orgs/{id})</w:t>
+              <w:t xml:space="preserve">CBAM/ETS regulatory guidance</w:t>
             </w:r>
           </w:p>
         </w:tc>
@@ -3807,183 +3183,7 @@
                 <w:sz w:val="20"/>
                 <w:szCs w:val="20"/>
               </w:rPr>
-              <w:t xml:space="preserve">8-tab management page: Overview, Sites, Tokens, Users, Thresholds, Energy, Alerts, Reports.</w:t>
-            </w:r>
-          </w:p>
-        </w:tc>
-      </w:tr>
-    </w:tbl>
-    <w:p>
-      <w:pPr>
-        <w:spacing w:after="0" w:before="0"/>
-      </w:pPr>
-      <w:r>
-        <w:t xml:space="preserve"/>
-      </w:r>
-    </w:p>
-    <w:p>
-      <w:pPr>
-        <w:spacing w:after="0" w:before="0"/>
-      </w:pPr>
-      <w:r>
-        <w:t xml:space="preserve"/>
-      </w:r>
-    </w:p>
-    <w:p>
-      <w:pPr>
-        <w:pStyle w:val="Heading1"/>
-        <w:pBdr>
-          <w:bottom w:val="single" w:color="38BDF8" w:sz="6" w:space="4"/>
-        </w:pBdr>
-        <w:spacing w:after="180" w:before="360"/>
-      </w:pPr>
-      <w:r>
-        <w:rPr>
-          <w:rFonts w:ascii="Arial" w:cs="Arial" w:eastAsia="Arial" w:hAnsi="Arial"/>
-          <w:b/>
-          <w:bCs/>
-          <w:color w:val="0F172A"/>
-          <w:sz w:val="32"/>
-          <w:szCs w:val="32"/>
-        </w:rPr>
-        <w:t xml:space="preserve">8. Uploading Factory Energy Data</w:t>
-      </w:r>
-    </w:p>
-    <w:p>
-      <w:pPr>
-        <w:spacing w:after="60" w:before="60"/>
-      </w:pPr>
-      <w:r>
-        <w:rPr>
-          <w:rFonts w:ascii="Arial" w:cs="Arial" w:eastAsia="Arial" w:hAnsi="Arial"/>
-          <w:color w:val="0F172A"/>
-          <w:sz w:val="22"/>
-          <w:szCs w:val="22"/>
-        </w:rPr>
-        <w:t xml:space="preserve">CEI works from existing utility bills — no hardware required. The fastest way to get data into the system is CSV upload.</w:t>
-      </w:r>
-    </w:p>
-    <w:p>
-      <w:pPr>
-        <w:spacing w:after="0" w:before="0"/>
-      </w:pPr>
-      <w:r>
-        <w:t xml:space="preserve"/>
-      </w:r>
-    </w:p>
-    <w:p>
-      <w:pPr>
-        <w:pStyle w:val="Heading2"/>
-        <w:spacing w:after="120" w:before="300"/>
-      </w:pPr>
-      <w:r>
-        <w:rPr>
-          <w:rFonts w:ascii="Arial" w:cs="Arial" w:eastAsia="Arial" w:hAnsi="Arial"/>
-          <w:b/>
-          <w:bCs/>
-          <w:color w:val="0F172A"/>
-          <w:sz w:val="26"/>
-          <w:szCs w:val="26"/>
-        </w:rPr>
-        <w:t xml:space="preserve">CSV Format</w:t>
-      </w:r>
-    </w:p>
-    <w:p>
-      <w:pPr>
-        <w:spacing w:after="60" w:before="60"/>
-      </w:pPr>
-      <w:r>
-        <w:rPr>
-          <w:rFonts w:ascii="Arial" w:cs="Arial" w:eastAsia="Arial" w:hAnsi="Arial"/>
-          <w:color w:val="0F172A"/>
-          <w:sz w:val="22"/>
-          <w:szCs w:val="22"/>
-        </w:rPr>
-        <w:t xml:space="preserve">CEI accepts any CSV with at least two columns: a timestamp and an energy value.</w:t>
-      </w:r>
-    </w:p>
-    <w:p>
-      <w:pPr>
-        <w:spacing w:after="0" w:before="0"/>
-      </w:pPr>
-      <w:r>
-        <w:t xml:space="preserve"/>
-      </w:r>
-    </w:p>
-    <w:tbl>
-      <w:tblPr>
-        <w:tblW w:type="dxa" w:w="9026"/>
-        <w:tblBorders>
-          <w:top w:val="single" w:color="auto" w:sz="4"/>
-          <w:left w:val="single" w:color="auto" w:sz="4"/>
-          <w:bottom w:val="single" w:color="auto" w:sz="4"/>
-          <w:right w:val="single" w:color="auto" w:sz="4"/>
-          <w:insideH w:val="single" w:color="auto" w:sz="4"/>
-          <w:insideV w:val="single" w:color="auto" w:sz="4"/>
-        </w:tblBorders>
-      </w:tblPr>
-      <w:tblGrid>
-        <w:gridCol w:w="3000"/>
-        <w:gridCol w:w="6026"/>
-      </w:tblGrid>
-      <w:tr>
-        <w:tc>
-          <w:tcPr>
-            <w:tcW w:type="dxa" w:w="3000"/>
-            <w:tcBorders>
-              <w:top w:val="single" w:color="E2E8F0" w:sz="4"/>
-              <w:left w:val="single" w:color="E2E8F0" w:sz="4"/>
-              <w:bottom w:val="single" w:color="E2E8F0" w:sz="4"/>
-              <w:right w:val="single" w:color="E2E8F0" w:sz="4"/>
-            </w:tcBorders>
-            <w:shd w:fill="F8FAFC" w:val="clear"/>
-            <w:tcMar>
-              <w:top w:type="dxa" w:w="80"/>
-              <w:left w:type="dxa" w:w="120"/>
-              <w:bottom w:type="dxa" w:w="80"/>
-              <w:right w:type="dxa" w:w="120"/>
-            </w:tcMar>
-          </w:tcPr>
-          <w:p>
-            <w:r>
-              <w:rPr>
-                <w:rFonts w:ascii="Arial" w:cs="Arial" w:eastAsia="Arial" w:hAnsi="Arial"/>
-                <w:b/>
-                <w:bCs/>
-                <w:color w:val="0F172A"/>
-                <w:sz w:val="20"/>
-                <w:szCs w:val="20"/>
-              </w:rPr>
-              <w:t xml:space="preserve">Timestamp column</w:t>
-            </w:r>
-          </w:p>
-        </w:tc>
-        <w:tc>
-          <w:tcPr>
-            <w:tcW w:type="dxa" w:w="6026"/>
-            <w:tcBorders>
-              <w:top w:val="single" w:color="E2E8F0" w:sz="4"/>
-              <w:left w:val="single" w:color="E2E8F0" w:sz="4"/>
-              <w:bottom w:val="single" w:color="E2E8F0" w:sz="4"/>
-              <w:right w:val="single" w:color="E2E8F0" w:sz="4"/>
-            </w:tcBorders>
-            <w:shd w:fill="FFFFFF" w:val="clear"/>
-            <w:tcMar>
-              <w:top w:type="dxa" w:w="80"/>
-              <w:left w:type="dxa" w:w="120"/>
-              <w:bottom w:type="dxa" w:w="80"/>
-              <w:right w:type="dxa" w:w="120"/>
-            </w:tcMar>
-          </w:tcPr>
-          <w:p>
-            <w:r>
-              <w:rPr>
-                <w:rFonts w:ascii="Arial" w:cs="Arial" w:eastAsia="Arial" w:hAnsi="Arial"/>
-                <w:color w:val="0F172A"/>
-                <w:sz w:val="20"/>
-                <w:szCs w:val="20"/>
-              </w:rPr>
-              <w:t xml:space="preserve">Any standard format: timestamp, datetime, date, ts. Supports ISO 8601, Italian date formats, Excel serial dates.</w:t>
+              <w:t xml:space="preserve">FIRE — federazione.it  |  FEDERESCO — federesco.org</w:t>
             </w:r>
           </w:p>
         </w:tc>
@@ -4016,7 +3216,7 @@
                 <w:sz w:val="20"/>
                 <w:szCs w:val="20"/>
               </w:rPr>
-              <w:t xml:space="preserve">Energy column</w:t>
+              <w:t xml:space="preserve">EU CBAM regulation</w:t>
             </w:r>
           </w:p>
         </w:tc>
@@ -4045,1009 +3245,7 @@
                 <w:sz w:val="20"/>
                 <w:szCs w:val="20"/>
               </w:rPr>
-              <w:t xml:space="preserve">Any of: value, kwh, energy, consumption. Values in kWh. Other columns are ignored.</w:t>
-            </w:r>
-          </w:p>
-        </w:tc>
-      </w:tr>
-      <w:tr>
-        <w:tc>
-          <w:tcPr>
-            <w:tcW w:type="dxa" w:w="3000"/>
-            <w:tcBorders>
-              <w:top w:val="single" w:color="E2E8F0" w:sz="4"/>
-              <w:left w:val="single" w:color="E2E8F0" w:sz="4"/>
-              <w:bottom w:val="single" w:color="E2E8F0" w:sz="4"/>
-              <w:right w:val="single" w:color="E2E8F0" w:sz="4"/>
-            </w:tcBorders>
-            <w:shd w:fill="F8FAFC" w:val="clear"/>
-            <w:tcMar>
-              <w:top w:type="dxa" w:w="80"/>
-              <w:left w:type="dxa" w:w="120"/>
-              <w:bottom w:type="dxa" w:w="80"/>
-              <w:right w:type="dxa" w:w="120"/>
-            </w:tcMar>
-          </w:tcPr>
-          <w:p>
-            <w:r>
-              <w:rPr>
-                <w:rFonts w:ascii="Arial" w:cs="Arial" w:eastAsia="Arial" w:hAnsi="Arial"/>
-                <w:b/>
-                <w:bCs/>
-                <w:color w:val="0F172A"/>
-                <w:sz w:val="20"/>
-                <w:szCs w:val="20"/>
-              </w:rPr>
-              <w:t xml:space="preserve">Timezone</w:t>
-            </w:r>
-          </w:p>
-        </w:tc>
-        <w:tc>
-          <w:tcPr>
-            <w:tcW w:type="dxa" w:w="6026"/>
-            <w:tcBorders>
-              <w:top w:val="single" w:color="E2E8F0" w:sz="4"/>
-              <w:left w:val="single" w:color="E2E8F0" w:sz="4"/>
-              <w:bottom w:val="single" w:color="E2E8F0" w:sz="4"/>
-              <w:right w:val="single" w:color="E2E8F0" w:sz="4"/>
-            </w:tcBorders>
-            <w:shd w:fill="FFFFFF" w:val="clear"/>
-            <w:tcMar>
-              <w:top w:type="dxa" w:w="80"/>
-              <w:left w:type="dxa" w:w="120"/>
-              <w:bottom w:type="dxa" w:w="80"/>
-              <w:right w:type="dxa" w:w="120"/>
-            </w:tcMar>
-          </w:tcPr>
-          <w:p>
-            <w:r>
-              <w:rPr>
-                <w:rFonts w:ascii="Arial" w:cs="Arial" w:eastAsia="Arial" w:hAnsi="Arial"/>
-                <w:color w:val="0F172A"/>
-                <w:sz w:val="20"/>
-                <w:szCs w:val="20"/>
-              </w:rPr>
-              <w:t xml:space="preserve">Italy: include timezone or CEI assumes Europe/Rome.</w:t>
-            </w:r>
-          </w:p>
-        </w:tc>
-      </w:tr>
-      <w:tr>
-        <w:tc>
-          <w:tcPr>
-            <w:tcW w:type="dxa" w:w="3000"/>
-            <w:tcBorders>
-              <w:top w:val="single" w:color="E2E8F0" w:sz="4"/>
-              <w:left w:val="single" w:color="E2E8F0" w:sz="4"/>
-              <w:bottom w:val="single" w:color="E2E8F0" w:sz="4"/>
-              <w:right w:val="single" w:color="E2E8F0" w:sz="4"/>
-            </w:tcBorders>
-            <w:shd w:fill="F8FAFC" w:val="clear"/>
-            <w:tcMar>
-              <w:top w:type="dxa" w:w="80"/>
-              <w:left w:type="dxa" w:w="120"/>
-              <w:bottom w:type="dxa" w:w="80"/>
-              <w:right w:type="dxa" w:w="120"/>
-            </w:tcMar>
-          </w:tcPr>
-          <w:p>
-            <w:r>
-              <w:rPr>
-                <w:rFonts w:ascii="Arial" w:cs="Arial" w:eastAsia="Arial" w:hAnsi="Arial"/>
-                <w:b/>
-                <w:bCs/>
-                <w:color w:val="0F172A"/>
-                <w:sz w:val="20"/>
-                <w:szCs w:val="20"/>
-              </w:rPr>
-              <w:t xml:space="preserve">Duplicates</w:t>
-            </w:r>
-          </w:p>
-        </w:tc>
-        <w:tc>
-          <w:tcPr>
-            <w:tcW w:type="dxa" w:w="6026"/>
-            <w:tcBorders>
-              <w:top w:val="single" w:color="E2E8F0" w:sz="4"/>
-              <w:left w:val="single" w:color="E2E8F0" w:sz="4"/>
-              <w:bottom w:val="single" w:color="E2E8F0" w:sz="4"/>
-              <w:right w:val="single" w:color="E2E8F0" w:sz="4"/>
-            </w:tcBorders>
-            <w:shd w:fill="F8FAFC" w:val="clear"/>
-            <w:tcMar>
-              <w:top w:type="dxa" w:w="80"/>
-              <w:left w:type="dxa" w:w="120"/>
-              <w:bottom w:type="dxa" w:w="80"/>
-              <w:right w:type="dxa" w:w="120"/>
-            </w:tcMar>
-          </w:tcPr>
-          <w:p>
-            <w:r>
-              <w:rPr>
-                <w:rFonts w:ascii="Arial" w:cs="Arial" w:eastAsia="Arial" w:hAnsi="Arial"/>
-                <w:color w:val="0F172A"/>
-                <w:sz w:val="20"/>
-                <w:szCs w:val="20"/>
-              </w:rPr>
-              <w:t xml:space="preserve">CEI silently ignores duplicate rows. Safe to re-upload the same file.</w:t>
-            </w:r>
-          </w:p>
-        </w:tc>
-      </w:tr>
-    </w:tbl>
-    <w:p>
-      <w:pPr>
-        <w:spacing w:after="0" w:before="0"/>
-      </w:pPr>
-      <w:r>
-        <w:t xml:space="preserve"/>
-      </w:r>
-    </w:p>
-    <w:p>
-      <w:pPr>
-        <w:pStyle w:val="Heading2"/>
-        <w:spacing w:after="120" w:before="300"/>
-      </w:pPr>
-      <w:r>
-        <w:rPr>
-          <w:rFonts w:ascii="Arial" w:cs="Arial" w:eastAsia="Arial" w:hAnsi="Arial"/>
-          <w:b/>
-          <w:bCs/>
-          <w:color w:val="0F172A"/>
-          <w:sz w:val="26"/>
-          <w:szCs w:val="26"/>
-        </w:rPr>
-        <w:t xml:space="preserve">How To Upload</w:t>
-      </w:r>
-    </w:p>
-    <w:tbl>
-      <w:tblPr>
-        <w:tblW w:type="dxa" w:w="9026"/>
-        <w:tblBorders>
-          <w:top w:val="single" w:color="auto" w:sz="4"/>
-          <w:left w:val="single" w:color="auto" w:sz="4"/>
-          <w:bottom w:val="single" w:color="auto" w:sz="4"/>
-          <w:right w:val="single" w:color="auto" w:sz="4"/>
-          <w:insideH w:val="single" w:color="auto" w:sz="4"/>
-          <w:insideV w:val="single" w:color="auto" w:sz="4"/>
-        </w:tblBorders>
-      </w:tblPr>
-      <w:tblGrid>
-        <w:gridCol w:w="700"/>
-        <w:gridCol w:w="8326"/>
-      </w:tblGrid>
-      <w:tr>
-        <w:tc>
-          <w:tcPr>
-            <w:tcW w:type="dxa" w:w="700"/>
-            <w:tcBorders>
-              <w:top w:val="single" w:color="38BDF8" w:sz="4"/>
-              <w:left w:val="single" w:color="38BDF8" w:sz="4"/>
-              <w:bottom w:val="single" w:color="38BDF8" w:sz="4"/>
-              <w:right w:val="single" w:color="38BDF8" w:sz="4"/>
-            </w:tcBorders>
-            <w:shd w:fill="0F172A" w:val="clear"/>
-            <w:tcMar>
-              <w:top w:type="dxa" w:w="100"/>
-              <w:left w:type="dxa" w:w="120"/>
-              <w:bottom w:type="dxa" w:w="100"/>
-              <w:right w:type="dxa" w:w="120"/>
-            </w:tcMar>
-            <w:vAlign w:val="center"/>
-          </w:tcPr>
-          <w:p>
-            <w:pPr>
-              <w:jc w:val="center"/>
-            </w:pPr>
-            <w:r>
-              <w:rPr>
-                <w:rFonts w:ascii="Arial" w:cs="Arial" w:eastAsia="Arial" w:hAnsi="Arial"/>
-                <w:b/>
-                <w:bCs/>
-                <w:color w:val="38BDF8"/>
-                <w:sz w:val="24"/>
-                <w:szCs w:val="24"/>
-              </w:rPr>
-              <w:t xml:space="preserve">1</w:t>
-            </w:r>
-          </w:p>
-        </w:tc>
-        <w:tc>
-          <w:tcPr>
-            <w:tcW w:type="dxa" w:w="8326"/>
-            <w:tcBorders>
-              <w:top w:val="single" w:color="E2E8F0" w:sz="4"/>
-              <w:left w:val="single" w:color="E2E8F0" w:sz="4"/>
-              <w:bottom w:val="single" w:color="E2E8F0" w:sz="4"/>
-              <w:right w:val="single" w:color="E2E8F0" w:sz="4"/>
-            </w:tcBorders>
-            <w:shd w:fill="FFFFFF" w:val="clear"/>
-            <w:tcMar>
-              <w:top w:type="dxa" w:w="100"/>
-              <w:left w:type="dxa" w:w="160"/>
-              <w:bottom w:type="dxa" w:w="100"/>
-              <w:right w:type="dxa" w:w="120"/>
-            </w:tcMar>
-          </w:tcPr>
-          <w:p>
-            <w:r>
-              <w:rPr>
-                <w:rFonts w:ascii="Arial" w:cs="Arial" w:eastAsia="Arial" w:hAnsi="Arial"/>
-                <w:b/>
-                <w:bCs/>
-                <w:color w:val="0F172A"/>
-                <w:sz w:val="22"/>
-                <w:szCs w:val="22"/>
-              </w:rPr>
-              <w:t xml:space="preserve">Go to the client org</w:t>
-            </w:r>
-          </w:p>
-          <w:p>
-            <w:pPr>
-              <w:spacing w:after="0" w:before="40"/>
-            </w:pPr>
-            <w:r>
-              <w:rPr>
-                <w:rFonts w:ascii="Arial" w:cs="Arial" w:eastAsia="Arial" w:hAnsi="Arial"/>
-                <w:color w:val="64748B"/>
-                <w:sz w:val="20"/>
-                <w:szCs w:val="20"/>
-              </w:rPr>
-              <w:t xml:space="preserve">From Manage dashboard, click the factory name.</w:t>
-            </w:r>
-          </w:p>
-        </w:tc>
-      </w:tr>
-      <w:tr>
-        <w:tc>
-          <w:tcPr>
-            <w:tcW w:type="dxa" w:w="700"/>
-            <w:tcBorders>
-              <w:top w:val="single" w:color="38BDF8" w:sz="4"/>
-              <w:left w:val="single" w:color="38BDF8" w:sz="4"/>
-              <w:bottom w:val="single" w:color="38BDF8" w:sz="4"/>
-              <w:right w:val="single" w:color="38BDF8" w:sz="4"/>
-            </w:tcBorders>
-            <w:shd w:fill="0F172A" w:val="clear"/>
-            <w:tcMar>
-              <w:top w:type="dxa" w:w="100"/>
-              <w:left w:type="dxa" w:w="120"/>
-              <w:bottom w:type="dxa" w:w="100"/>
-              <w:right w:type="dxa" w:w="120"/>
-            </w:tcMar>
-            <w:vAlign w:val="center"/>
-          </w:tcPr>
-          <w:p>
-            <w:pPr>
-              <w:jc w:val="center"/>
-            </w:pPr>
-            <w:r>
-              <w:rPr>
-                <w:rFonts w:ascii="Arial" w:cs="Arial" w:eastAsia="Arial" w:hAnsi="Arial"/>
-                <w:b/>
-                <w:bCs/>
-                <w:color w:val="38BDF8"/>
-                <w:sz w:val="24"/>
-                <w:szCs w:val="24"/>
-              </w:rPr>
-              <w:t xml:space="preserve">2</w:t>
-            </w:r>
-          </w:p>
-        </w:tc>
-        <w:tc>
-          <w:tcPr>
-            <w:tcW w:type="dxa" w:w="8326"/>
-            <w:tcBorders>
-              <w:top w:val="single" w:color="E2E8F0" w:sz="4"/>
-              <w:left w:val="single" w:color="E2E8F0" w:sz="4"/>
-              <w:bottom w:val="single" w:color="E2E8F0" w:sz="4"/>
-              <w:right w:val="single" w:color="E2E8F0" w:sz="4"/>
-            </w:tcBorders>
-            <w:shd w:fill="F8FAFC" w:val="clear"/>
-            <w:tcMar>
-              <w:top w:type="dxa" w:w="100"/>
-              <w:left w:type="dxa" w:w="160"/>
-              <w:bottom w:type="dxa" w:w="100"/>
-              <w:right w:type="dxa" w:w="120"/>
-            </w:tcMar>
-          </w:tcPr>
-          <w:p>
-            <w:r>
-              <w:rPr>
-                <w:rFonts w:ascii="Arial" w:cs="Arial" w:eastAsia="Arial" w:hAnsi="Arial"/>
-                <w:b/>
-                <w:bCs/>
-                <w:color w:val="0F172A"/>
-                <w:sz w:val="22"/>
-                <w:szCs w:val="22"/>
-              </w:rPr>
-              <w:t xml:space="preserve">Open the Sites tab</w:t>
-            </w:r>
-          </w:p>
-          <w:p>
-            <w:pPr>
-              <w:spacing w:after="0" w:before="40"/>
-            </w:pPr>
-            <w:r>
-              <w:rPr>
-                <w:rFonts w:ascii="Arial" w:cs="Arial" w:eastAsia="Arial" w:hAnsi="Arial"/>
-                <w:color w:val="64748B"/>
-                <w:sz w:val="20"/>
-                <w:szCs w:val="20"/>
-              </w:rPr>
-              <w:t xml:space="preserve">Confirm the factory has at least one site configured.</w:t>
-            </w:r>
-          </w:p>
-        </w:tc>
-      </w:tr>
-      <w:tr>
-        <w:tc>
-          <w:tcPr>
-            <w:tcW w:type="dxa" w:w="700"/>
-            <w:tcBorders>
-              <w:top w:val="single" w:color="38BDF8" w:sz="4"/>
-              <w:left w:val="single" w:color="38BDF8" w:sz="4"/>
-              <w:bottom w:val="single" w:color="38BDF8" w:sz="4"/>
-              <w:right w:val="single" w:color="38BDF8" w:sz="4"/>
-            </w:tcBorders>
-            <w:shd w:fill="0F172A" w:val="clear"/>
-            <w:tcMar>
-              <w:top w:type="dxa" w:w="100"/>
-              <w:left w:type="dxa" w:w="120"/>
-              <w:bottom w:type="dxa" w:w="100"/>
-              <w:right w:type="dxa" w:w="120"/>
-            </w:tcMar>
-            <w:vAlign w:val="center"/>
-          </w:tcPr>
-          <w:p>
-            <w:pPr>
-              <w:jc w:val="center"/>
-            </w:pPr>
-            <w:r>
-              <w:rPr>
-                <w:rFonts w:ascii="Arial" w:cs="Arial" w:eastAsia="Arial" w:hAnsi="Arial"/>
-                <w:b/>
-                <w:bCs/>
-                <w:color w:val="38BDF8"/>
-                <w:sz w:val="24"/>
-                <w:szCs w:val="24"/>
-              </w:rPr>
-              <w:t xml:space="preserve">3</w:t>
-            </w:r>
-          </w:p>
-        </w:tc>
-        <w:tc>
-          <w:tcPr>
-            <w:tcW w:type="dxa" w:w="8326"/>
-            <w:tcBorders>
-              <w:top w:val="single" w:color="E2E8F0" w:sz="4"/>
-              <w:left w:val="single" w:color="E2E8F0" w:sz="4"/>
-              <w:bottom w:val="single" w:color="E2E8F0" w:sz="4"/>
-              <w:right w:val="single" w:color="E2E8F0" w:sz="4"/>
-            </w:tcBorders>
-            <w:shd w:fill="FFFFFF" w:val="clear"/>
-            <w:tcMar>
-              <w:top w:type="dxa" w:w="100"/>
-              <w:left w:type="dxa" w:w="160"/>
-              <w:bottom w:type="dxa" w:w="100"/>
-              <w:right w:type="dxa" w:w="120"/>
-            </w:tcMar>
-          </w:tcPr>
-          <w:p>
-            <w:r>
-              <w:rPr>
-                <w:rFonts w:ascii="Arial" w:cs="Arial" w:eastAsia="Arial" w:hAnsi="Arial"/>
-                <w:b/>
-                <w:bCs/>
-                <w:color w:val="0F172A"/>
-                <w:sz w:val="22"/>
-                <w:szCs w:val="22"/>
-              </w:rPr>
-              <w:t xml:space="preserve">Click the site name</w:t>
-            </w:r>
-          </w:p>
-          <w:p>
-            <w:pPr>
-              <w:spacing w:after="0" w:before="40"/>
-            </w:pPr>
-            <w:r>
-              <w:rPr>
-                <w:rFonts w:ascii="Arial" w:cs="Arial" w:eastAsia="Arial" w:hAnsi="Arial"/>
-                <w:color w:val="64748B"/>
-                <w:sz w:val="20"/>
-                <w:szCs w:val="20"/>
-              </w:rPr>
-              <w:t xml:space="preserve">Opens the full site view.</w:t>
-            </w:r>
-          </w:p>
-        </w:tc>
-      </w:tr>
-      <w:tr>
-        <w:tc>
-          <w:tcPr>
-            <w:tcW w:type="dxa" w:w="700"/>
-            <w:tcBorders>
-              <w:top w:val="single" w:color="38BDF8" w:sz="4"/>
-              <w:left w:val="single" w:color="38BDF8" w:sz="4"/>
-              <w:bottom w:val="single" w:color="38BDF8" w:sz="4"/>
-              <w:right w:val="single" w:color="38BDF8" w:sz="4"/>
-            </w:tcBorders>
-            <w:shd w:fill="0F172A" w:val="clear"/>
-            <w:tcMar>
-              <w:top w:type="dxa" w:w="100"/>
-              <w:left w:type="dxa" w:w="120"/>
-              <w:bottom w:type="dxa" w:w="100"/>
-              <w:right w:type="dxa" w:w="120"/>
-            </w:tcMar>
-            <w:vAlign w:val="center"/>
-          </w:tcPr>
-          <w:p>
-            <w:pPr>
-              <w:jc w:val="center"/>
-            </w:pPr>
-            <w:r>
-              <w:rPr>
-                <w:rFonts w:ascii="Arial" w:cs="Arial" w:eastAsia="Arial" w:hAnsi="Arial"/>
-                <w:b/>
-                <w:bCs/>
-                <w:color w:val="38BDF8"/>
-                <w:sz w:val="24"/>
-                <w:szCs w:val="24"/>
-              </w:rPr>
-              <w:t xml:space="preserve">4</w:t>
-            </w:r>
-          </w:p>
-        </w:tc>
-        <w:tc>
-          <w:tcPr>
-            <w:tcW w:type="dxa" w:w="8326"/>
-            <w:tcBorders>
-              <w:top w:val="single" w:color="E2E8F0" w:sz="4"/>
-              <w:left w:val="single" w:color="E2E8F0" w:sz="4"/>
-              <w:bottom w:val="single" w:color="E2E8F0" w:sz="4"/>
-              <w:right w:val="single" w:color="E2E8F0" w:sz="4"/>
-            </w:tcBorders>
-            <w:shd w:fill="F8FAFC" w:val="clear"/>
-            <w:tcMar>
-              <w:top w:type="dxa" w:w="100"/>
-              <w:left w:type="dxa" w:w="160"/>
-              <w:bottom w:type="dxa" w:w="100"/>
-              <w:right w:type="dxa" w:w="120"/>
-            </w:tcMar>
-          </w:tcPr>
-          <w:p>
-            <w:r>
-              <w:rPr>
-                <w:rFonts w:ascii="Arial" w:cs="Arial" w:eastAsia="Arial" w:hAnsi="Arial"/>
-                <w:b/>
-                <w:bCs/>
-                <w:color w:val="0F172A"/>
-                <w:sz w:val="22"/>
-                <w:szCs w:val="22"/>
-              </w:rPr>
-              <w:t xml:space="preserve">Use Upload CSV</w:t>
-            </w:r>
-          </w:p>
-          <w:p>
-            <w:pPr>
-              <w:spacing w:after="0" w:before="40"/>
-            </w:pPr>
-            <w:r>
-              <w:rPr>
-                <w:rFonts w:ascii="Arial" w:cs="Arial" w:eastAsia="Arial" w:hAnsi="Arial"/>
-                <w:color w:val="64748B"/>
-                <w:sz w:val="20"/>
-                <w:szCs w:val="20"/>
-              </w:rPr>
-              <w:t xml:space="preserve">Upload the factory's utility bill data. CEI processes it immediately.</w:t>
-            </w:r>
-          </w:p>
-        </w:tc>
-      </w:tr>
-      <w:tr>
-        <w:tc>
-          <w:tcPr>
-            <w:tcW w:type="dxa" w:w="700"/>
-            <w:tcBorders>
-              <w:top w:val="single" w:color="38BDF8" w:sz="4"/>
-              <w:left w:val="single" w:color="38BDF8" w:sz="4"/>
-              <w:bottom w:val="single" w:color="38BDF8" w:sz="4"/>
-              <w:right w:val="single" w:color="38BDF8" w:sz="4"/>
-            </w:tcBorders>
-            <w:shd w:fill="0F172A" w:val="clear"/>
-            <w:tcMar>
-              <w:top w:type="dxa" w:w="100"/>
-              <w:left w:type="dxa" w:w="120"/>
-              <w:bottom w:type="dxa" w:w="100"/>
-              <w:right w:type="dxa" w:w="120"/>
-            </w:tcMar>
-            <w:vAlign w:val="center"/>
-          </w:tcPr>
-          <w:p>
-            <w:pPr>
-              <w:jc w:val="center"/>
-            </w:pPr>
-            <w:r>
-              <w:rPr>
-                <w:rFonts w:ascii="Arial" w:cs="Arial" w:eastAsia="Arial" w:hAnsi="Arial"/>
-                <w:b/>
-                <w:bCs/>
-                <w:color w:val="38BDF8"/>
-                <w:sz w:val="24"/>
-                <w:szCs w:val="24"/>
-              </w:rPr>
-              <w:t xml:space="preserve">5</w:t>
-            </w:r>
-          </w:p>
-        </w:tc>
-        <w:tc>
-          <w:tcPr>
-            <w:tcW w:type="dxa" w:w="8326"/>
-            <w:tcBorders>
-              <w:top w:val="single" w:color="E2E8F0" w:sz="4"/>
-              <w:left w:val="single" w:color="E2E8F0" w:sz="4"/>
-              <w:bottom w:val="single" w:color="E2E8F0" w:sz="4"/>
-              <w:right w:val="single" w:color="E2E8F0" w:sz="4"/>
-            </w:tcBorders>
-            <w:shd w:fill="FFFFFF" w:val="clear"/>
-            <w:tcMar>
-              <w:top w:type="dxa" w:w="100"/>
-              <w:left w:type="dxa" w:w="160"/>
-              <w:bottom w:type="dxa" w:w="100"/>
-              <w:right w:type="dxa" w:w="120"/>
-            </w:tcMar>
-          </w:tcPr>
-          <w:p>
-            <w:r>
-              <w:rPr>
-                <w:rFonts w:ascii="Arial" w:cs="Arial" w:eastAsia="Arial" w:hAnsi="Arial"/>
-                <w:b/>
-                <w:bCs/>
-                <w:color w:val="0F172A"/>
-                <w:sz w:val="22"/>
-                <w:szCs w:val="22"/>
-              </w:rPr>
-              <w:t xml:space="preserve">Check the Energy tab</w:t>
-            </w:r>
-          </w:p>
-          <w:p>
-            <w:pPr>
-              <w:spacing w:after="0" w:before="40"/>
-            </w:pPr>
-            <w:r>
-              <w:rPr>
-                <w:rFonts w:ascii="Arial" w:cs="Arial" w:eastAsia="Arial" w:hAnsi="Arial"/>
-                <w:color w:val="64748B"/>
-                <w:sz w:val="20"/>
-                <w:szCs w:val="20"/>
-              </w:rPr>
-              <w:t xml:space="preserve">The client card on your portal will update within seconds.</w:t>
-            </w:r>
-          </w:p>
-        </w:tc>
-      </w:tr>
-    </w:tbl>
-    <w:p>
-      <w:pPr>
-        <w:spacing w:after="0" w:before="0"/>
-      </w:pPr>
-      <w:r>
-        <w:t xml:space="preserve"/>
-      </w:r>
-    </w:p>
-    <w:tbl>
-      <w:tblPr>
-        <w:tblW w:type="dxa" w:w="9026"/>
-        <w:tblBorders>
-          <w:top w:val="single" w:color="auto" w:sz="4"/>
-          <w:left w:val="single" w:color="auto" w:sz="4"/>
-          <w:bottom w:val="single" w:color="auto" w:sz="4"/>
-          <w:right w:val="single" w:color="auto" w:sz="4"/>
-          <w:insideH w:val="single" w:color="auto" w:sz="4"/>
-          <w:insideV w:val="single" w:color="auto" w:sz="4"/>
-        </w:tblBorders>
-      </w:tblPr>
-      <w:tblGrid>
-        <w:gridCol w:w="9026"/>
-      </w:tblGrid>
-      <w:tr>
-        <w:tc>
-          <w:tcPr>
-            <w:tcW w:type="dxa" w:w="9026"/>
-            <w:tcBorders>
-              <w:top w:val="single" w:color="38BDF8" w:sz="4"/>
-              <w:left w:val="single" w:color="38BDF8" w:sz="16"/>
-              <w:bottom w:val="single" w:color="38BDF8" w:sz="4"/>
-              <w:right w:val="single" w:color="38BDF8" w:sz="4"/>
-            </w:tcBorders>
-            <w:shd w:fill="F0F9FF" w:val="clear"/>
-            <w:tcMar>
-              <w:top w:type="dxa" w:w="100"/>
-              <w:left w:type="dxa" w:w="200"/>
-              <w:bottom w:type="dxa" w:w="100"/>
-              <w:right w:type="dxa" w:w="160"/>
-            </w:tcMar>
-          </w:tcPr>
-          <w:p>
-            <w:r>
-              <w:rPr>
-                <w:rFonts w:ascii="Arial" w:cs="Arial" w:eastAsia="Arial" w:hAnsi="Arial"/>
-                <w:color w:val="0F172A"/>
-                <w:sz w:val="20"/>
-                <w:szCs w:val="20"/>
-              </w:rPr>
-              <w:t xml:space="preserve">For the 30-day free diagnostic, upload 90+ days of utility bill data to achieve high-confidence CBAM extrapolation. The more historical data, the more accurate the annual projection.</w:t>
-            </w:r>
-          </w:p>
-        </w:tc>
-      </w:tr>
-    </w:tbl>
-    <w:p>
-      <w:pPr>
-        <w:spacing w:after="0" w:before="0"/>
-      </w:pPr>
-      <w:r>
-        <w:t xml:space="preserve"/>
-      </w:r>
-    </w:p>
-    <w:p>
-      <w:pPr>
-        <w:spacing w:after="0" w:before="0"/>
-      </w:pPr>
-      <w:r>
-        <w:t xml:space="preserve"/>
-      </w:r>
-    </w:p>
-    <w:p>
-      <w:pPr>
-        <w:pStyle w:val="Heading1"/>
-        <w:pBdr>
-          <w:bottom w:val="single" w:color="38BDF8" w:sz="6" w:space="4"/>
-        </w:pBdr>
-        <w:spacing w:after="180" w:before="360"/>
-      </w:pPr>
-      <w:r>
-        <w:rPr>
-          <w:rFonts w:ascii="Arial" w:cs="Arial" w:eastAsia="Arial" w:hAnsi="Arial"/>
-          <w:b/>
-          <w:bCs/>
-          <w:color w:val="0F172A"/>
-          <w:sz w:val="32"/>
-          <w:szCs w:val="32"/>
-        </w:rPr>
-        <w:t xml:space="preserve">9. Getting Help</w:t>
-      </w:r>
-    </w:p>
-    <w:p>
-      <w:pPr>
-        <w:spacing w:after="0" w:before="0"/>
-      </w:pPr>
-      <w:r>
-        <w:t xml:space="preserve"/>
-      </w:r>
-    </w:p>
-    <w:tbl>
-      <w:tblPr>
-        <w:tblW w:type="dxa" w:w="9026"/>
-        <w:tblBorders>
-          <w:top w:val="single" w:color="auto" w:sz="4"/>
-          <w:left w:val="single" w:color="auto" w:sz="4"/>
-          <w:bottom w:val="single" w:color="auto" w:sz="4"/>
-          <w:right w:val="single" w:color="auto" w:sz="4"/>
-          <w:insideH w:val="single" w:color="auto" w:sz="4"/>
-          <w:insideV w:val="single" w:color="auto" w:sz="4"/>
-        </w:tblBorders>
-      </w:tblPr>
-      <w:tblGrid>
-        <w:gridCol w:w="3000"/>
-        <w:gridCol w:w="6026"/>
-      </w:tblGrid>
-      <w:tr>
-        <w:tc>
-          <w:tcPr>
-            <w:tcW w:type="dxa" w:w="3000"/>
-            <w:tcBorders>
-              <w:top w:val="single" w:color="E2E8F0" w:sz="4"/>
-              <w:left w:val="single" w:color="E2E8F0" w:sz="4"/>
-              <w:bottom w:val="single" w:color="E2E8F0" w:sz="4"/>
-              <w:right w:val="single" w:color="E2E8F0" w:sz="4"/>
-            </w:tcBorders>
-            <w:shd w:fill="F8FAFC" w:val="clear"/>
-            <w:tcMar>
-              <w:top w:type="dxa" w:w="80"/>
-              <w:left w:type="dxa" w:w="120"/>
-              <w:bottom w:type="dxa" w:w="80"/>
-              <w:right w:type="dxa" w:w="120"/>
-            </w:tcMar>
-          </w:tcPr>
-          <w:p>
-            <w:r>
-              <w:rPr>
-                <w:rFonts w:ascii="Arial" w:cs="Arial" w:eastAsia="Arial" w:hAnsi="Arial"/>
-                <w:b/>
-                <w:bCs/>
-                <w:color w:val="0F172A"/>
-                <w:sz w:val="20"/>
-                <w:szCs w:val="20"/>
-              </w:rPr>
-              <w:t xml:space="preserve">Technical support</w:t>
-            </w:r>
-          </w:p>
-        </w:tc>
-        <w:tc>
-          <w:tcPr>
-            <w:tcW w:type="dxa" w:w="6026"/>
-            <w:tcBorders>
-              <w:top w:val="single" w:color="E2E8F0" w:sz="4"/>
-              <w:left w:val="single" w:color="E2E8F0" w:sz="4"/>
-              <w:bottom w:val="single" w:color="E2E8F0" w:sz="4"/>
-              <w:right w:val="single" w:color="E2E8F0" w:sz="4"/>
-            </w:tcBorders>
-            <w:shd w:fill="FFFFFF" w:val="clear"/>
-            <w:tcMar>
-              <w:top w:type="dxa" w:w="80"/>
-              <w:left w:type="dxa" w:w="120"/>
-              <w:bottom w:type="dxa" w:w="80"/>
-              <w:right w:type="dxa" w:w="120"/>
-            </w:tcMar>
-          </w:tcPr>
-          <w:p>
-            <w:r>
-              <w:rPr>
-                <w:rFonts w:ascii="Arial" w:cs="Arial" w:eastAsia="Arial" w:hAnsi="Arial"/>
-                <w:color w:val="0F172A"/>
-                <w:sz w:val="20"/>
-                <w:szCs w:val="20"/>
-              </w:rPr>
-              <w:t xml:space="preserve">support@carbonefficiencyintel.com</w:t>
-            </w:r>
-          </w:p>
-        </w:tc>
-      </w:tr>
-      <w:tr>
-        <w:tc>
-          <w:tcPr>
-            <w:tcW w:type="dxa" w:w="3000"/>
-            <w:tcBorders>
-              <w:top w:val="single" w:color="E2E8F0" w:sz="4"/>
-              <w:left w:val="single" w:color="E2E8F0" w:sz="4"/>
-              <w:bottom w:val="single" w:color="E2E8F0" w:sz="4"/>
-              <w:right w:val="single" w:color="E2E8F0" w:sz="4"/>
-            </w:tcBorders>
-            <w:shd w:fill="F8FAFC" w:val="clear"/>
-            <w:tcMar>
-              <w:top w:type="dxa" w:w="80"/>
-              <w:left w:type="dxa" w:w="120"/>
-              <w:bottom w:type="dxa" w:w="80"/>
-              <w:right w:type="dxa" w:w="120"/>
-            </w:tcMar>
-          </w:tcPr>
-          <w:p>
-            <w:r>
-              <w:rPr>
-                <w:rFonts w:ascii="Arial" w:cs="Arial" w:eastAsia="Arial" w:hAnsi="Arial"/>
-                <w:b/>
-                <w:bCs/>
-                <w:color w:val="0F172A"/>
-                <w:sz w:val="20"/>
-                <w:szCs w:val="20"/>
-              </w:rPr>
-              <w:t xml:space="preserve">Platform</w:t>
-            </w:r>
-          </w:p>
-        </w:tc>
-        <w:tc>
-          <w:tcPr>
-            <w:tcW w:type="dxa" w:w="6026"/>
-            <w:tcBorders>
-              <w:top w:val="single" w:color="E2E8F0" w:sz="4"/>
-              <w:left w:val="single" w:color="E2E8F0" w:sz="4"/>
-              <w:bottom w:val="single" w:color="E2E8F0" w:sz="4"/>
-              <w:right w:val="single" w:color="E2E8F0" w:sz="4"/>
-            </w:tcBorders>
-            <w:shd w:fill="F8FAFC" w:val="clear"/>
-            <w:tcMar>
-              <w:top w:type="dxa" w:w="80"/>
-              <w:left w:type="dxa" w:w="120"/>
-              <w:bottom w:type="dxa" w:w="80"/>
-              <w:right w:type="dxa" w:w="120"/>
-            </w:tcMar>
-          </w:tcPr>
-          <w:p>
-            <w:r>
-              <w:rPr>
-                <w:rFonts w:ascii="Arial" w:cs="Arial" w:eastAsia="Arial" w:hAnsi="Arial"/>
-                <w:color w:val="0F172A"/>
-                <w:sz w:val="20"/>
-                <w:szCs w:val="20"/>
-              </w:rPr>
-              <w:t xml:space="preserve">app.carbonefficiencyintel.com</w:t>
-            </w:r>
-          </w:p>
-        </w:tc>
-      </w:tr>
-      <w:tr>
-        <w:tc>
-          <w:tcPr>
-            <w:tcW w:type="dxa" w:w="3000"/>
-            <w:tcBorders>
-              <w:top w:val="single" w:color="E2E8F0" w:sz="4"/>
-              <w:left w:val="single" w:color="E2E8F0" w:sz="4"/>
-              <w:bottom w:val="single" w:color="E2E8F0" w:sz="4"/>
-              <w:right w:val="single" w:color="E2E8F0" w:sz="4"/>
-            </w:tcBorders>
-            <w:shd w:fill="F8FAFC" w:val="clear"/>
-            <w:tcMar>
-              <w:top w:type="dxa" w:w="80"/>
-              <w:left w:type="dxa" w:w="120"/>
-              <w:bottom w:type="dxa" w:w="80"/>
-              <w:right w:type="dxa" w:w="120"/>
-            </w:tcMar>
-          </w:tcPr>
-          <w:p>
-            <w:r>
-              <w:rPr>
-                <w:rFonts w:ascii="Arial" w:cs="Arial" w:eastAsia="Arial" w:hAnsi="Arial"/>
-                <w:b/>
-                <w:bCs/>
-                <w:color w:val="0F172A"/>
-                <w:sz w:val="20"/>
-                <w:szCs w:val="20"/>
-              </w:rPr>
-              <w:t xml:space="preserve">CBAM/ETS regulatory guidance</w:t>
-            </w:r>
-          </w:p>
-        </w:tc>
-        <w:tc>
-          <w:tcPr>
-            <w:tcW w:type="dxa" w:w="6026"/>
-            <w:tcBorders>
-              <w:top w:val="single" w:color="E2E8F0" w:sz="4"/>
-              <w:left w:val="single" w:color="E2E8F0" w:sz="4"/>
-              <w:bottom w:val="single" w:color="E2E8F0" w:sz="4"/>
-              <w:right w:val="single" w:color="E2E8F0" w:sz="4"/>
-            </w:tcBorders>
-            <w:shd w:fill="FFFFFF" w:val="clear"/>
-            <w:tcMar>
-              <w:top w:type="dxa" w:w="80"/>
-              <w:left w:type="dxa" w:w="120"/>
-              <w:bottom w:type="dxa" w:w="80"/>
-              <w:right w:type="dxa" w:w="120"/>
-            </w:tcMar>
-          </w:tcPr>
-          <w:p>
-            <w:r>
-              <w:rPr>
-                <w:rFonts w:ascii="Arial" w:cs="Arial" w:eastAsia="Arial" w:hAnsi="Arial"/>
-                <w:color w:val="0F172A"/>
-                <w:sz w:val="20"/>
-                <w:szCs w:val="20"/>
-              </w:rPr>
-              <w:t xml:space="preserve">FIRE — federazione.it · FEDERESCO — federesco.org</w:t>
-            </w:r>
-          </w:p>
-        </w:tc>
-      </w:tr>
-      <w:tr>
-        <w:tc>
-          <w:tcPr>
-            <w:tcW w:type="dxa" w:w="3000"/>
-            <w:tcBorders>
-              <w:top w:val="single" w:color="E2E8F0" w:sz="4"/>
-              <w:left w:val="single" w:color="E2E8F0" w:sz="4"/>
-              <w:bottom w:val="single" w:color="E2E8F0" w:sz="4"/>
-              <w:right w:val="single" w:color="E2E8F0" w:sz="4"/>
-            </w:tcBorders>
-            <w:shd w:fill="F8FAFC" w:val="clear"/>
-            <w:tcMar>
-              <w:top w:type="dxa" w:w="80"/>
-              <w:left w:type="dxa" w:w="120"/>
-              <w:bottom w:type="dxa" w:w="80"/>
-              <w:right w:type="dxa" w:w="120"/>
-            </w:tcMar>
-          </w:tcPr>
-          <w:p>
-            <w:r>
-              <w:rPr>
-                <w:rFonts w:ascii="Arial" w:cs="Arial" w:eastAsia="Arial" w:hAnsi="Arial"/>
-                <w:b/>
-                <w:bCs/>
-                <w:color w:val="0F172A"/>
-                <w:sz w:val="20"/>
-                <w:szCs w:val="20"/>
-              </w:rPr>
-              <w:t xml:space="preserve">EU CBAM regulation</w:t>
-            </w:r>
-          </w:p>
-        </w:tc>
-        <w:tc>
-          <w:tcPr>
-            <w:tcW w:type="dxa" w:w="6026"/>
-            <w:tcBorders>
-              <w:top w:val="single" w:color="E2E8F0" w:sz="4"/>
-              <w:left w:val="single" w:color="E2E8F0" w:sz="4"/>
-              <w:bottom w:val="single" w:color="E2E8F0" w:sz="4"/>
-              <w:right w:val="single" w:color="E2E8F0" w:sz="4"/>
-            </w:tcBorders>
-            <w:shd w:fill="F8FAFC" w:val="clear"/>
-            <w:tcMar>
-              <w:top w:type="dxa" w:w="80"/>
-              <w:left w:type="dxa" w:w="120"/>
-              <w:bottom w:type="dxa" w:w="80"/>
-              <w:right w:type="dxa" w:w="120"/>
-            </w:tcMar>
-          </w:tcPr>
-          <w:p>
-            <w:r>
-              <w:rPr>
-                <w:rFonts w:ascii="Arial" w:cs="Arial" w:eastAsia="Arial" w:hAnsi="Arial"/>
-                <w:color w:val="0F172A"/>
-                <w:sz w:val="20"/>
-                <w:szCs w:val="20"/>
-              </w:rPr>
               <w:t xml:space="preserve">Regulation (EU) 2023/956 — eur-lex.europa.eu</w:t>
-            </w:r>
-          </w:p>
-        </w:tc>
-      </w:tr>
-      <w:tr>
-        <w:tc>
-          <w:tcPr>
-            <w:tcW w:type="dxa" w:w="3000"/>
-            <w:tcBorders>
-              <w:top w:val="single" w:color="E2E8F0" w:sz="4"/>
-              <w:left w:val="single" w:color="E2E8F0" w:sz="4"/>
-              <w:bottom w:val="single" w:color="E2E8F0" w:sz="4"/>
-              <w:right w:val="single" w:color="E2E8F0" w:sz="4"/>
-            </w:tcBorders>
-            <w:shd w:fill="F8FAFC" w:val="clear"/>
-            <w:tcMar>
-              <w:top w:type="dxa" w:w="80"/>
-              <w:left w:type="dxa" w:w="120"/>
-              <w:bottom w:type="dxa" w:w="80"/>
-              <w:right w:type="dxa" w:w="120"/>
-            </w:tcMar>
-          </w:tcPr>
-          <w:p>
-            <w:r>
-              <w:rPr>
-                <w:rFonts w:ascii="Arial" w:cs="Arial" w:eastAsia="Arial" w:hAnsi="Arial"/>
-                <w:b/>
-                <w:bCs/>
-                <w:color w:val="0F172A"/>
-                <w:sz w:val="20"/>
-                <w:szCs w:val="20"/>
-              </w:rPr>
-              <w:t xml:space="preserve">ETS free allocations</w:t>
-            </w:r>
-          </w:p>
-        </w:tc>
-        <w:tc>
-          <w:tcPr>
-            <w:tcW w:type="dxa" w:w="6026"/>
-            <w:tcBorders>
-              <w:top w:val="single" w:color="E2E8F0" w:sz="4"/>
-              <w:left w:val="single" w:color="E2E8F0" w:sz="4"/>
-              <w:bottom w:val="single" w:color="E2E8F0" w:sz="4"/>
-              <w:right w:val="single" w:color="E2E8F0" w:sz="4"/>
-            </w:tcBorders>
-            <w:shd w:fill="FFFFFF" w:val="clear"/>
-            <w:tcMar>
-              <w:top w:type="dxa" w:w="80"/>
-              <w:left w:type="dxa" w:w="120"/>
-              <w:bottom w:type="dxa" w:w="80"/>
-              <w:right w:type="dxa" w:w="120"/>
-            </w:tcMar>
-          </w:tcPr>
-          <w:p>
-            <w:r>
-              <w:rPr>
-                <w:rFonts w:ascii="Arial" w:cs="Arial" w:eastAsia="Arial" w:hAnsi="Arial"/>
-                <w:color w:val="0F172A"/>
-                <w:sz w:val="20"/>
-                <w:szCs w:val="20"/>
-              </w:rPr>
-              <w:t xml:space="preserve">EU Transaction Log — eutl.eea.europa.eu</w:t>
             </w:r>
           </w:p>
         </w:tc>
@@ -5078,7 +3276,7 @@
           <w:sz w:val="18"/>
           <w:szCs w:val="18"/>
         </w:rPr>
-        <w:t xml:space="preserve">CEI — Carbon Efficiency Intelligence · carbonefficiencyintel.com</w:t>
+        <w:t xml:space="preserve">CEI — Carbon Efficiency Intelligence  |  carbonefficiencyintel.com</w:t>
       </w:r>
     </w:p>
     <w:sectPr>

</xml_diff>